<commit_message>
Document des informations légales : sans couleurs, questions simplifiées, hébergeur et cookies retirés
Co-Authored-By: Claude Sonnet 5.5 <noreply@anthropic.com>
</commit_message>
<xml_diff>
--- a/docs/Informations_pages_legales_Zabantu.docx
+++ b/docs/Informations_pages_legales_Zabantu.docx
@@ -11,7 +11,6 @@
           <w:rFonts w:ascii="Arial" w:cs="Arial" w:eastAsia="Arial" w:hAnsi="Arial"/>
           <w:b/>
           <w:bCs/>
-          <w:color w:val="2F4A2C"/>
           <w:sz w:val="36"/>
           <w:szCs w:val="36"/>
         </w:rPr>
@@ -25,7 +24,6 @@
       <w:r>
         <w:rPr>
           <w:rFonts w:ascii="Arial" w:cs="Arial" w:eastAsia="Arial" w:hAnsi="Arial"/>
-          <w:color w:val="555555"/>
           <w:sz w:val="24"/>
           <w:szCs w:val="24"/>
         </w:rPr>
@@ -42,7 +40,7 @@
           <w:sz w:val="20"/>
           <w:szCs w:val="20"/>
         </w:rPr>
-        <w:t xml:space="preserve">Le site doit afficher des mentions légales, une politique de confidentialité et une politique de cookies, conformément aux exigences de l’APDP. Les textes sont rédigés ; il manque des informations que seul le groupe peut donner.</w:t>
+        <w:t xml:space="preserve">Le site doit afficher des mentions légales, une politique de confidentialité et une politique de cookies. Les textes sont déjà rédigés ; il manque quelques informations que seul le groupe peut donner.</w:t>
       </w:r>
     </w:p>
     <w:p>
@@ -65,30 +63,7 @@
           <w:sz w:val="20"/>
           <w:szCs w:val="20"/>
         </w:rPr>
-        <w:t xml:space="preserve">chaque ligne présente ce que nous savons ou notre proposition (colonne verte). Si c’est exact, ne rien écrire. Si c’est faux ou à changer, écrire la bonne information dans la colonne jaune. Les lignes marquées « Non connu » doivent obligatoirement être complétées.</w:t>
-      </w:r>
-    </w:p>
-    <w:p>
-      <w:pPr>
-        <w:spacing w:after="80"/>
-      </w:pPr>
-      <w:r>
-        <w:rPr>
-          <w:rFonts w:ascii="Arial" w:cs="Arial" w:eastAsia="Arial" w:hAnsi="Arial"/>
-          <w:b/>
-          <w:bCs/>
-          <w:sz w:val="20"/>
-          <w:szCs w:val="20"/>
-        </w:rPr>
-        <w:t xml:space="preserve">Retour : </w:t>
-      </w:r>
-      <w:r>
-        <w:rPr>
-          <w:rFonts w:ascii="Arial" w:cs="Arial" w:eastAsia="Arial" w:hAnsi="Arial"/>
-          <w:sz w:val="20"/>
-          <w:szCs w:val="20"/>
-        </w:rPr>
-        <w:t xml:space="preserve">renvoyer le document rempli à la personne chargée du site.</w:t>
+        <w:t xml:space="preserve">la colonne « Ce que nous avons (ou proposons) » donne notre information ou notre proposition. Si elle vous convient, ne rien écrire. Sinon, écrire la bonne information dans la dernière colonne.</w:t>
       </w:r>
     </w:p>
     <w:p>
@@ -102,11 +77,10 @@
           <w:rFonts w:ascii="Arial" w:cs="Arial" w:eastAsia="Arial" w:hAnsi="Arial"/>
           <w:b/>
           <w:bCs/>
-          <w:color w:val="2F4A2C"/>
           <w:sz w:val="26"/>
           <w:szCs w:val="26"/>
         </w:rPr>
-        <w:t xml:space="preserve">1. Éditeur du site et responsable du traitement</w:t>
+        <w:t xml:space="preserve">1. Éditeur du site</w:t>
       </w:r>
     </w:p>
     <w:tbl>
@@ -135,12 +109,11 @@
           <w:tcPr>
             <w:tcW w:type="dxa" w:w="600"/>
             <w:tcBorders>
-              <w:top w:val="single" w:color="B8C0AE" w:sz="4"/>
-              <w:left w:val="single" w:color="B8C0AE" w:sz="4"/>
-              <w:bottom w:val="single" w:color="B8C0AE" w:sz="4"/>
-              <w:right w:val="single" w:color="B8C0AE" w:sz="4"/>
-            </w:tcBorders>
-            <w:shd w:fill="2F4A2C" w:color="auto" w:val="clear"/>
+              <w:top w:val="single" w:color="000000" w:sz="4"/>
+              <w:left w:val="single" w:color="000000" w:sz="4"/>
+              <w:bottom w:val="single" w:color="000000" w:sz="4"/>
+              <w:right w:val="single" w:color="000000" w:sz="4"/>
+            </w:tcBorders>
             <w:tcMar>
               <w:top w:type="dxa" w:w="70"/>
               <w:left w:type="dxa" w:w="100"/>
@@ -157,7 +130,6 @@
                 <w:rFonts w:ascii="Arial" w:cs="Arial" w:eastAsia="Arial" w:hAnsi="Arial"/>
                 <w:b/>
                 <w:bCs/>
-                <w:color w:val="FFFFFF"/>
                 <w:sz w:val="20"/>
                 <w:szCs w:val="20"/>
               </w:rPr>
@@ -169,12 +141,11 @@
           <w:tcPr>
             <w:tcW w:type="dxa" w:w="3000"/>
             <w:tcBorders>
-              <w:top w:val="single" w:color="B8C0AE" w:sz="4"/>
-              <w:left w:val="single" w:color="B8C0AE" w:sz="4"/>
-              <w:bottom w:val="single" w:color="B8C0AE" w:sz="4"/>
-              <w:right w:val="single" w:color="B8C0AE" w:sz="4"/>
-            </w:tcBorders>
-            <w:shd w:fill="2F4A2C" w:color="auto" w:val="clear"/>
+              <w:top w:val="single" w:color="000000" w:sz="4"/>
+              <w:left w:val="single" w:color="000000" w:sz="4"/>
+              <w:bottom w:val="single" w:color="000000" w:sz="4"/>
+              <w:right w:val="single" w:color="000000" w:sz="4"/>
+            </w:tcBorders>
             <w:tcMar>
               <w:top w:type="dxa" w:w="70"/>
               <w:left w:type="dxa" w:w="100"/>
@@ -191,11 +162,10 @@
                 <w:rFonts w:ascii="Arial" w:cs="Arial" w:eastAsia="Arial" w:hAnsi="Arial"/>
                 <w:b/>
                 <w:bCs/>
-                <w:color w:val="FFFFFF"/>
-                <w:sz w:val="20"/>
-                <w:szCs w:val="20"/>
-              </w:rPr>
-              <w:t xml:space="preserve">Information demandée</w:t>
+                <w:sz w:val="20"/>
+                <w:szCs w:val="20"/>
+              </w:rPr>
+              <w:t xml:space="preserve">Information</w:t>
             </w:r>
           </w:p>
         </w:tc>
@@ -203,12 +173,11 @@
           <w:tcPr>
             <w:tcW w:type="dxa" w:w="5800"/>
             <w:tcBorders>
-              <w:top w:val="single" w:color="B8C0AE" w:sz="4"/>
-              <w:left w:val="single" w:color="B8C0AE" w:sz="4"/>
-              <w:bottom w:val="single" w:color="B8C0AE" w:sz="4"/>
-              <w:right w:val="single" w:color="B8C0AE" w:sz="4"/>
-            </w:tcBorders>
-            <w:shd w:fill="2F4A2C" w:color="auto" w:val="clear"/>
+              <w:top w:val="single" w:color="000000" w:sz="4"/>
+              <w:left w:val="single" w:color="000000" w:sz="4"/>
+              <w:bottom w:val="single" w:color="000000" w:sz="4"/>
+              <w:right w:val="single" w:color="000000" w:sz="4"/>
+            </w:tcBorders>
             <w:tcMar>
               <w:top w:type="dxa" w:w="70"/>
               <w:left w:type="dxa" w:w="100"/>
@@ -225,11 +194,10 @@
                 <w:rFonts w:ascii="Arial" w:cs="Arial" w:eastAsia="Arial" w:hAnsi="Arial"/>
                 <w:b/>
                 <w:bCs/>
-                <w:color w:val="FFFFFF"/>
-                <w:sz w:val="20"/>
-                <w:szCs w:val="20"/>
-              </w:rPr>
-              <w:t xml:space="preserve">Ce que nous savons / notre proposition</w:t>
+                <w:sz w:val="20"/>
+                <w:szCs w:val="20"/>
+              </w:rPr>
+              <w:t xml:space="preserve">Ce que nous avons (ou proposons)</w:t>
             </w:r>
           </w:p>
         </w:tc>
@@ -237,12 +205,11 @@
           <w:tcPr>
             <w:tcW w:type="dxa" w:w="5438"/>
             <w:tcBorders>
-              <w:top w:val="single" w:color="B8C0AE" w:sz="4"/>
-              <w:left w:val="single" w:color="B8C0AE" w:sz="4"/>
-              <w:bottom w:val="single" w:color="B8C0AE" w:sz="4"/>
-              <w:right w:val="single" w:color="B8C0AE" w:sz="4"/>
-            </w:tcBorders>
-            <w:shd w:fill="2F4A2C" w:color="auto" w:val="clear"/>
+              <w:top w:val="single" w:color="000000" w:sz="4"/>
+              <w:left w:val="single" w:color="000000" w:sz="4"/>
+              <w:bottom w:val="single" w:color="000000" w:sz="4"/>
+              <w:right w:val="single" w:color="000000" w:sz="4"/>
+            </w:tcBorders>
             <w:tcMar>
               <w:top w:type="dxa" w:w="70"/>
               <w:left w:type="dxa" w:w="100"/>
@@ -259,11 +226,10 @@
                 <w:rFonts w:ascii="Arial" w:cs="Arial" w:eastAsia="Arial" w:hAnsi="Arial"/>
                 <w:b/>
                 <w:bCs/>
-                <w:color w:val="FFFFFF"/>
-                <w:sz w:val="20"/>
-                <w:szCs w:val="20"/>
-              </w:rPr>
-              <w:t xml:space="preserve">Correction du groupe (à remplir si différent)</w:t>
+                <w:sz w:val="20"/>
+                <w:szCs w:val="20"/>
+              </w:rPr>
+              <w:t xml:space="preserve">Correction du groupe (seulement si différent)</w:t>
             </w:r>
           </w:p>
         </w:tc>
@@ -276,10 +242,10 @@
           <w:tcPr>
             <w:tcW w:type="dxa" w:w="600"/>
             <w:tcBorders>
-              <w:top w:val="single" w:color="B8C0AE" w:sz="4"/>
-              <w:left w:val="single" w:color="B8C0AE" w:sz="4"/>
-              <w:bottom w:val="single" w:color="B8C0AE" w:sz="4"/>
-              <w:right w:val="single" w:color="B8C0AE" w:sz="4"/>
+              <w:top w:val="single" w:color="000000" w:sz="4"/>
+              <w:left w:val="single" w:color="000000" w:sz="4"/>
+              <w:bottom w:val="single" w:color="000000" w:sz="4"/>
+              <w:right w:val="single" w:color="000000" w:sz="4"/>
             </w:tcBorders>
             <w:tcMar>
               <w:top w:type="dxa" w:w="70"/>
@@ -306,10 +272,10 @@
           <w:tcPr>
             <w:tcW w:type="dxa" w:w="3000"/>
             <w:tcBorders>
-              <w:top w:val="single" w:color="B8C0AE" w:sz="4"/>
-              <w:left w:val="single" w:color="B8C0AE" w:sz="4"/>
-              <w:bottom w:val="single" w:color="B8C0AE" w:sz="4"/>
-              <w:right w:val="single" w:color="B8C0AE" w:sz="4"/>
+              <w:top w:val="single" w:color="000000" w:sz="4"/>
+              <w:left w:val="single" w:color="000000" w:sz="4"/>
+              <w:bottom w:val="single" w:color="000000" w:sz="4"/>
+              <w:right w:val="single" w:color="000000" w:sz="4"/>
             </w:tcBorders>
             <w:tcMar>
               <w:top w:type="dxa" w:w="70"/>
@@ -338,12 +304,11 @@
           <w:tcPr>
             <w:tcW w:type="dxa" w:w="5800"/>
             <w:tcBorders>
-              <w:top w:val="single" w:color="B8C0AE" w:sz="4"/>
-              <w:left w:val="single" w:color="B8C0AE" w:sz="4"/>
-              <w:bottom w:val="single" w:color="B8C0AE" w:sz="4"/>
-              <w:right w:val="single" w:color="B8C0AE" w:sz="4"/>
-            </w:tcBorders>
-            <w:shd w:fill="EEF0E8" w:color="auto" w:val="clear"/>
+              <w:top w:val="single" w:color="000000" w:sz="4"/>
+              <w:left w:val="single" w:color="000000" w:sz="4"/>
+              <w:bottom w:val="single" w:color="000000" w:sz="4"/>
+              <w:right w:val="single" w:color="000000" w:sz="4"/>
+            </w:tcBorders>
             <w:tcMar>
               <w:top w:type="dxa" w:w="70"/>
               <w:left w:type="dxa" w:w="100"/>
@@ -369,12 +334,11 @@
           <w:tcPr>
             <w:tcW w:type="dxa" w:w="5438"/>
             <w:tcBorders>
-              <w:top w:val="single" w:color="B8C0AE" w:sz="4"/>
-              <w:left w:val="single" w:color="B8C0AE" w:sz="4"/>
-              <w:bottom w:val="single" w:color="B8C0AE" w:sz="4"/>
-              <w:right w:val="single" w:color="B8C0AE" w:sz="4"/>
-            </w:tcBorders>
-            <w:shd w:fill="FFF3C4" w:color="auto" w:val="clear"/>
+              <w:top w:val="single" w:color="000000" w:sz="4"/>
+              <w:left w:val="single" w:color="000000" w:sz="4"/>
+              <w:bottom w:val="single" w:color="000000" w:sz="4"/>
+              <w:right w:val="single" w:color="000000" w:sz="4"/>
+            </w:tcBorders>
             <w:tcMar>
               <w:top w:type="dxa" w:w="70"/>
               <w:left w:type="dxa" w:w="100"/>
@@ -405,10 +369,10 @@
           <w:tcPr>
             <w:tcW w:type="dxa" w:w="600"/>
             <w:tcBorders>
-              <w:top w:val="single" w:color="B8C0AE" w:sz="4"/>
-              <w:left w:val="single" w:color="B8C0AE" w:sz="4"/>
-              <w:bottom w:val="single" w:color="B8C0AE" w:sz="4"/>
-              <w:right w:val="single" w:color="B8C0AE" w:sz="4"/>
+              <w:top w:val="single" w:color="000000" w:sz="4"/>
+              <w:left w:val="single" w:color="000000" w:sz="4"/>
+              <w:bottom w:val="single" w:color="000000" w:sz="4"/>
+              <w:right w:val="single" w:color="000000" w:sz="4"/>
             </w:tcBorders>
             <w:tcMar>
               <w:top w:type="dxa" w:w="70"/>
@@ -435,10 +399,10 @@
           <w:tcPr>
             <w:tcW w:type="dxa" w:w="3000"/>
             <w:tcBorders>
-              <w:top w:val="single" w:color="B8C0AE" w:sz="4"/>
-              <w:left w:val="single" w:color="B8C0AE" w:sz="4"/>
-              <w:bottom w:val="single" w:color="B8C0AE" w:sz="4"/>
-              <w:right w:val="single" w:color="B8C0AE" w:sz="4"/>
+              <w:top w:val="single" w:color="000000" w:sz="4"/>
+              <w:left w:val="single" w:color="000000" w:sz="4"/>
+              <w:bottom w:val="single" w:color="000000" w:sz="4"/>
+              <w:right w:val="single" w:color="000000" w:sz="4"/>
             </w:tcBorders>
             <w:tcMar>
               <w:top w:type="dxa" w:w="70"/>
@@ -467,12 +431,11 @@
           <w:tcPr>
             <w:tcW w:type="dxa" w:w="5800"/>
             <w:tcBorders>
-              <w:top w:val="single" w:color="B8C0AE" w:sz="4"/>
-              <w:left w:val="single" w:color="B8C0AE" w:sz="4"/>
-              <w:bottom w:val="single" w:color="B8C0AE" w:sz="4"/>
-              <w:right w:val="single" w:color="B8C0AE" w:sz="4"/>
-            </w:tcBorders>
-            <w:shd w:fill="EEF0E8" w:color="auto" w:val="clear"/>
+              <w:top w:val="single" w:color="000000" w:sz="4"/>
+              <w:left w:val="single" w:color="000000" w:sz="4"/>
+              <w:bottom w:val="single" w:color="000000" w:sz="4"/>
+              <w:right w:val="single" w:color="000000" w:sz="4"/>
+            </w:tcBorders>
             <w:tcMar>
               <w:top w:type="dxa" w:w="70"/>
               <w:left w:type="dxa" w:w="100"/>
@@ -498,12 +461,11 @@
           <w:tcPr>
             <w:tcW w:type="dxa" w:w="5438"/>
             <w:tcBorders>
-              <w:top w:val="single" w:color="B8C0AE" w:sz="4"/>
-              <w:left w:val="single" w:color="B8C0AE" w:sz="4"/>
-              <w:bottom w:val="single" w:color="B8C0AE" w:sz="4"/>
-              <w:right w:val="single" w:color="B8C0AE" w:sz="4"/>
-            </w:tcBorders>
-            <w:shd w:fill="FFF3C4" w:color="auto" w:val="clear"/>
+              <w:top w:val="single" w:color="000000" w:sz="4"/>
+              <w:left w:val="single" w:color="000000" w:sz="4"/>
+              <w:bottom w:val="single" w:color="000000" w:sz="4"/>
+              <w:right w:val="single" w:color="000000" w:sz="4"/>
+            </w:tcBorders>
             <w:tcMar>
               <w:top w:type="dxa" w:w="70"/>
               <w:left w:type="dxa" w:w="100"/>
@@ -534,10 +496,10 @@
           <w:tcPr>
             <w:tcW w:type="dxa" w:w="600"/>
             <w:tcBorders>
-              <w:top w:val="single" w:color="B8C0AE" w:sz="4"/>
-              <w:left w:val="single" w:color="B8C0AE" w:sz="4"/>
-              <w:bottom w:val="single" w:color="B8C0AE" w:sz="4"/>
-              <w:right w:val="single" w:color="B8C0AE" w:sz="4"/>
+              <w:top w:val="single" w:color="000000" w:sz="4"/>
+              <w:left w:val="single" w:color="000000" w:sz="4"/>
+              <w:bottom w:val="single" w:color="000000" w:sz="4"/>
+              <w:right w:val="single" w:color="000000" w:sz="4"/>
             </w:tcBorders>
             <w:tcMar>
               <w:top w:type="dxa" w:w="70"/>
@@ -564,10 +526,10 @@
           <w:tcPr>
             <w:tcW w:type="dxa" w:w="3000"/>
             <w:tcBorders>
-              <w:top w:val="single" w:color="B8C0AE" w:sz="4"/>
-              <w:left w:val="single" w:color="B8C0AE" w:sz="4"/>
-              <w:bottom w:val="single" w:color="B8C0AE" w:sz="4"/>
-              <w:right w:val="single" w:color="B8C0AE" w:sz="4"/>
+              <w:top w:val="single" w:color="000000" w:sz="4"/>
+              <w:left w:val="single" w:color="000000" w:sz="4"/>
+              <w:bottom w:val="single" w:color="000000" w:sz="4"/>
+              <w:right w:val="single" w:color="000000" w:sz="4"/>
             </w:tcBorders>
             <w:tcMar>
               <w:top w:type="dxa" w:w="70"/>
@@ -596,30 +558,29 @@
           <w:tcPr>
             <w:tcW w:type="dxa" w:w="5800"/>
             <w:tcBorders>
-              <w:top w:val="single" w:color="B8C0AE" w:sz="4"/>
-              <w:left w:val="single" w:color="B8C0AE" w:sz="4"/>
-              <w:bottom w:val="single" w:color="B8C0AE" w:sz="4"/>
-              <w:right w:val="single" w:color="B8C0AE" w:sz="4"/>
-            </w:tcBorders>
-            <w:shd w:fill="EEF0E8" w:color="auto" w:val="clear"/>
-            <w:tcMar>
-              <w:top w:type="dxa" w:w="70"/>
-              <w:left w:type="dxa" w:w="100"/>
-              <w:bottom w:type="dxa" w:w="70"/>
-              <w:right w:type="dxa" w:w="100"/>
-            </w:tcMar>
-          </w:tcPr>
-          <w:p>
-            <w:pPr>
-              <w:spacing w:after="80"/>
-            </w:pPr>
-            <w:r>
-              <w:rPr>
-                <w:rFonts w:ascii="Arial" w:cs="Arial" w:eastAsia="Arial" w:hAnsi="Arial"/>
-                <w:sz w:val="20"/>
-                <w:szCs w:val="20"/>
-              </w:rPr>
-              <w:t xml:space="preserve">Faculté des Sciences Économiques et de Gestion (FSEG), Campus universitaire de Badalabougou, Bamako, Mali. Le site utilise cette adresse partout (pied de page, page Contact, mentions légales).</w:t>
+              <w:top w:val="single" w:color="000000" w:sz="4"/>
+              <w:left w:val="single" w:color="000000" w:sz="4"/>
+              <w:bottom w:val="single" w:color="000000" w:sz="4"/>
+              <w:right w:val="single" w:color="000000" w:sz="4"/>
+            </w:tcBorders>
+            <w:tcMar>
+              <w:top w:type="dxa" w:w="70"/>
+              <w:left w:type="dxa" w:w="100"/>
+              <w:bottom w:type="dxa" w:w="70"/>
+              <w:right w:type="dxa" w:w="100"/>
+            </w:tcMar>
+          </w:tcPr>
+          <w:p>
+            <w:pPr>
+              <w:spacing w:after="80"/>
+            </w:pPr>
+            <w:r>
+              <w:rPr>
+                <w:rFonts w:ascii="Arial" w:cs="Arial" w:eastAsia="Arial" w:hAnsi="Arial"/>
+                <w:sz w:val="20"/>
+                <w:szCs w:val="20"/>
+              </w:rPr>
+              <w:t xml:space="preserve">Faculté des Sciences Économiques et de Gestion (FSEG), Campus universitaire de Badalabougou, Bamako, Mali.</w:t>
             </w:r>
           </w:p>
         </w:tc>
@@ -627,12 +588,11 @@
           <w:tcPr>
             <w:tcW w:type="dxa" w:w="5438"/>
             <w:tcBorders>
-              <w:top w:val="single" w:color="B8C0AE" w:sz="4"/>
-              <w:left w:val="single" w:color="B8C0AE" w:sz="4"/>
-              <w:bottom w:val="single" w:color="B8C0AE" w:sz="4"/>
-              <w:right w:val="single" w:color="B8C0AE" w:sz="4"/>
-            </w:tcBorders>
-            <w:shd w:fill="FFF3C4" w:color="auto" w:val="clear"/>
+              <w:top w:val="single" w:color="000000" w:sz="4"/>
+              <w:left w:val="single" w:color="000000" w:sz="4"/>
+              <w:bottom w:val="single" w:color="000000" w:sz="4"/>
+              <w:right w:val="single" w:color="000000" w:sz="4"/>
+            </w:tcBorders>
             <w:tcMar>
               <w:top w:type="dxa" w:w="70"/>
               <w:left w:type="dxa" w:w="100"/>
@@ -663,10 +623,10 @@
           <w:tcPr>
             <w:tcW w:type="dxa" w:w="600"/>
             <w:tcBorders>
-              <w:top w:val="single" w:color="B8C0AE" w:sz="4"/>
-              <w:left w:val="single" w:color="B8C0AE" w:sz="4"/>
-              <w:bottom w:val="single" w:color="B8C0AE" w:sz="4"/>
-              <w:right w:val="single" w:color="B8C0AE" w:sz="4"/>
+              <w:top w:val="single" w:color="000000" w:sz="4"/>
+              <w:left w:val="single" w:color="000000" w:sz="4"/>
+              <w:bottom w:val="single" w:color="000000" w:sz="4"/>
+              <w:right w:val="single" w:color="000000" w:sz="4"/>
             </w:tcBorders>
             <w:tcMar>
               <w:top w:type="dxa" w:w="70"/>
@@ -693,10 +653,10 @@
           <w:tcPr>
             <w:tcW w:type="dxa" w:w="3000"/>
             <w:tcBorders>
-              <w:top w:val="single" w:color="B8C0AE" w:sz="4"/>
-              <w:left w:val="single" w:color="B8C0AE" w:sz="4"/>
-              <w:bottom w:val="single" w:color="B8C0AE" w:sz="4"/>
-              <w:right w:val="single" w:color="B8C0AE" w:sz="4"/>
+              <w:top w:val="single" w:color="000000" w:sz="4"/>
+              <w:left w:val="single" w:color="000000" w:sz="4"/>
+              <w:bottom w:val="single" w:color="000000" w:sz="4"/>
+              <w:right w:val="single" w:color="000000" w:sz="4"/>
             </w:tcBorders>
             <w:tcMar>
               <w:top w:type="dxa" w:w="70"/>
@@ -717,7 +677,7 @@
                 <w:sz w:val="20"/>
                 <w:szCs w:val="20"/>
               </w:rPr>
-              <w:t xml:space="preserve">Téléphones du groupe</w:t>
+              <w:t xml:space="preserve">Adresse e-mail de contact</w:t>
             </w:r>
           </w:p>
         </w:tc>
@@ -725,30 +685,29 @@
           <w:tcPr>
             <w:tcW w:type="dxa" w:w="5800"/>
             <w:tcBorders>
-              <w:top w:val="single" w:color="B8C0AE" w:sz="4"/>
-              <w:left w:val="single" w:color="B8C0AE" w:sz="4"/>
-              <w:bottom w:val="single" w:color="B8C0AE" w:sz="4"/>
-              <w:right w:val="single" w:color="B8C0AE" w:sz="4"/>
-            </w:tcBorders>
-            <w:shd w:fill="EEF0E8" w:color="auto" w:val="clear"/>
-            <w:tcMar>
-              <w:top w:type="dxa" w:w="70"/>
-              <w:left w:type="dxa" w:w="100"/>
-              <w:bottom w:type="dxa" w:w="70"/>
-              <w:right w:type="dxa" w:w="100"/>
-            </w:tcMar>
-          </w:tcPr>
-          <w:p>
-            <w:pPr>
-              <w:spacing w:after="80"/>
-            </w:pPr>
-            <w:r>
-              <w:rPr>
-                <w:rFonts w:ascii="Arial" w:cs="Arial" w:eastAsia="Arial" w:hAnsi="Arial"/>
-                <w:sz w:val="20"/>
-                <w:szCs w:val="20"/>
-              </w:rPr>
-              <w:t xml:space="preserve">+223 77 94 14 70 et +223 76 63 45 15 (numéros du groupe Zabantu, et non ceux de la FSEG). Affichés avec l’indicatif sur tout le site.</w:t>
+              <w:top w:val="single" w:color="000000" w:sz="4"/>
+              <w:left w:val="single" w:color="000000" w:sz="4"/>
+              <w:bottom w:val="single" w:color="000000" w:sz="4"/>
+              <w:right w:val="single" w:color="000000" w:sz="4"/>
+            </w:tcBorders>
+            <w:tcMar>
+              <w:top w:type="dxa" w:w="70"/>
+              <w:left w:type="dxa" w:w="100"/>
+              <w:bottom w:type="dxa" w:w="70"/>
+              <w:right w:type="dxa" w:w="100"/>
+            </w:tcMar>
+          </w:tcPr>
+          <w:p>
+            <w:pPr>
+              <w:spacing w:after="80"/>
+            </w:pPr>
+            <w:r>
+              <w:rPr>
+                <w:rFonts w:ascii="Arial" w:cs="Arial" w:eastAsia="Arial" w:hAnsi="Arial"/>
+                <w:sz w:val="20"/>
+                <w:szCs w:val="20"/>
+              </w:rPr>
+              <w:t xml:space="preserve">Info@zabantu.net.</w:t>
             </w:r>
           </w:p>
         </w:tc>
@@ -756,141 +715,11 @@
           <w:tcPr>
             <w:tcW w:type="dxa" w:w="5438"/>
             <w:tcBorders>
-              <w:top w:val="single" w:color="B8C0AE" w:sz="4"/>
-              <w:left w:val="single" w:color="B8C0AE" w:sz="4"/>
-              <w:bottom w:val="single" w:color="B8C0AE" w:sz="4"/>
-              <w:right w:val="single" w:color="B8C0AE" w:sz="4"/>
-            </w:tcBorders>
-            <w:shd w:fill="FFF3C4" w:color="auto" w:val="clear"/>
-            <w:tcMar>
-              <w:top w:type="dxa" w:w="70"/>
-              <w:left w:type="dxa" w:w="100"/>
-              <w:bottom w:type="dxa" w:w="70"/>
-              <w:right w:type="dxa" w:w="100"/>
-            </w:tcMar>
-          </w:tcPr>
-          <w:p>
-            <w:pPr>
-              <w:spacing w:after="80"/>
-            </w:pPr>
-            <w:r>
-              <w:rPr>
-                <w:rFonts w:ascii="Arial" w:cs="Arial" w:eastAsia="Arial" w:hAnsi="Arial"/>
-                <w:sz w:val="20"/>
-                <w:szCs w:val="20"/>
-              </w:rPr>
-              <w:t xml:space="preserve"/>
-            </w:r>
-          </w:p>
-        </w:tc>
-      </w:tr>
-      <w:tr>
-        <w:trPr>
-          <w:cantSplit/>
-        </w:trPr>
-        <w:tc>
-          <w:tcPr>
-            <w:tcW w:type="dxa" w:w="600"/>
-            <w:tcBorders>
-              <w:top w:val="single" w:color="B8C0AE" w:sz="4"/>
-              <w:left w:val="single" w:color="B8C0AE" w:sz="4"/>
-              <w:bottom w:val="single" w:color="B8C0AE" w:sz="4"/>
-              <w:right w:val="single" w:color="B8C0AE" w:sz="4"/>
-            </w:tcBorders>
-            <w:tcMar>
-              <w:top w:type="dxa" w:w="70"/>
-              <w:left w:type="dxa" w:w="100"/>
-              <w:bottom w:type="dxa" w:w="70"/>
-              <w:right w:type="dxa" w:w="100"/>
-            </w:tcMar>
-          </w:tcPr>
-          <w:p>
-            <w:pPr>
-              <w:spacing w:after="80"/>
-            </w:pPr>
-            <w:r>
-              <w:rPr>
-                <w:rFonts w:ascii="Arial" w:cs="Arial" w:eastAsia="Arial" w:hAnsi="Arial"/>
-                <w:sz w:val="20"/>
-                <w:szCs w:val="20"/>
-              </w:rPr>
-              <w:t xml:space="preserve">1.5</w:t>
-            </w:r>
-          </w:p>
-        </w:tc>
-        <w:tc>
-          <w:tcPr>
-            <w:tcW w:type="dxa" w:w="3000"/>
-            <w:tcBorders>
-              <w:top w:val="single" w:color="B8C0AE" w:sz="4"/>
-              <w:left w:val="single" w:color="B8C0AE" w:sz="4"/>
-              <w:bottom w:val="single" w:color="B8C0AE" w:sz="4"/>
-              <w:right w:val="single" w:color="B8C0AE" w:sz="4"/>
-            </w:tcBorders>
-            <w:tcMar>
-              <w:top w:type="dxa" w:w="70"/>
-              <w:left w:type="dxa" w:w="100"/>
-              <w:bottom w:type="dxa" w:w="70"/>
-              <w:right w:type="dxa" w:w="100"/>
-            </w:tcMar>
-          </w:tcPr>
-          <w:p>
-            <w:pPr>
-              <w:spacing w:after="80"/>
-            </w:pPr>
-            <w:r>
-              <w:rPr>
-                <w:rFonts w:ascii="Arial" w:cs="Arial" w:eastAsia="Arial" w:hAnsi="Arial"/>
-                <w:b/>
-                <w:bCs/>
-                <w:sz w:val="20"/>
-                <w:szCs w:val="20"/>
-              </w:rPr>
-              <w:t xml:space="preserve">Adresse e-mail de contact</w:t>
-            </w:r>
-          </w:p>
-        </w:tc>
-        <w:tc>
-          <w:tcPr>
-            <w:tcW w:type="dxa" w:w="5800"/>
-            <w:tcBorders>
-              <w:top w:val="single" w:color="B8C0AE" w:sz="4"/>
-              <w:left w:val="single" w:color="B8C0AE" w:sz="4"/>
-              <w:bottom w:val="single" w:color="B8C0AE" w:sz="4"/>
-              <w:right w:val="single" w:color="B8C0AE" w:sz="4"/>
-            </w:tcBorders>
-            <w:shd w:fill="EEF0E8" w:color="auto" w:val="clear"/>
-            <w:tcMar>
-              <w:top w:type="dxa" w:w="70"/>
-              <w:left w:type="dxa" w:w="100"/>
-              <w:bottom w:type="dxa" w:w="70"/>
-              <w:right w:type="dxa" w:w="100"/>
-            </w:tcMar>
-          </w:tcPr>
-          <w:p>
-            <w:pPr>
-              <w:spacing w:after="80"/>
-            </w:pPr>
-            <w:r>
-              <w:rPr>
-                <w:rFonts w:ascii="Arial" w:cs="Arial" w:eastAsia="Arial" w:hAnsi="Arial"/>
-                <w:sz w:val="20"/>
-                <w:szCs w:val="20"/>
-              </w:rPr>
-              <w:t xml:space="preserve">Info@zabantu.net.</w:t>
-            </w:r>
-          </w:p>
-        </w:tc>
-        <w:tc>
-          <w:tcPr>
-            <w:tcW w:type="dxa" w:w="5438"/>
-            <w:tcBorders>
-              <w:top w:val="single" w:color="B8C0AE" w:sz="4"/>
-              <w:left w:val="single" w:color="B8C0AE" w:sz="4"/>
-              <w:bottom w:val="single" w:color="B8C0AE" w:sz="4"/>
-              <w:right w:val="single" w:color="B8C0AE" w:sz="4"/>
-            </w:tcBorders>
-            <w:shd w:fill="FFF3C4" w:color="auto" w:val="clear"/>
+              <w:top w:val="single" w:color="000000" w:sz="4"/>
+              <w:left w:val="single" w:color="000000" w:sz="4"/>
+              <w:bottom w:val="single" w:color="000000" w:sz="4"/>
+              <w:right w:val="single" w:color="000000" w:sz="4"/>
+            </w:tcBorders>
             <w:tcMar>
               <w:top w:type="dxa" w:w="70"/>
               <w:left w:type="dxa" w:w="100"/>
@@ -925,7 +754,6 @@
           <w:rFonts w:ascii="Arial" w:cs="Arial" w:eastAsia="Arial" w:hAnsi="Arial"/>
           <w:b/>
           <w:bCs/>
-          <w:color w:val="2F4A2C"/>
           <w:sz w:val="26"/>
           <w:szCs w:val="26"/>
         </w:rPr>
@@ -958,12 +786,11 @@
           <w:tcPr>
             <w:tcW w:type="dxa" w:w="600"/>
             <w:tcBorders>
-              <w:top w:val="single" w:color="B8C0AE" w:sz="4"/>
-              <w:left w:val="single" w:color="B8C0AE" w:sz="4"/>
-              <w:bottom w:val="single" w:color="B8C0AE" w:sz="4"/>
-              <w:right w:val="single" w:color="B8C0AE" w:sz="4"/>
-            </w:tcBorders>
-            <w:shd w:fill="2F4A2C" w:color="auto" w:val="clear"/>
+              <w:top w:val="single" w:color="000000" w:sz="4"/>
+              <w:left w:val="single" w:color="000000" w:sz="4"/>
+              <w:bottom w:val="single" w:color="000000" w:sz="4"/>
+              <w:right w:val="single" w:color="000000" w:sz="4"/>
+            </w:tcBorders>
             <w:tcMar>
               <w:top w:type="dxa" w:w="70"/>
               <w:left w:type="dxa" w:w="100"/>
@@ -980,7 +807,6 @@
                 <w:rFonts w:ascii="Arial" w:cs="Arial" w:eastAsia="Arial" w:hAnsi="Arial"/>
                 <w:b/>
                 <w:bCs/>
-                <w:color w:val="FFFFFF"/>
                 <w:sz w:val="20"/>
                 <w:szCs w:val="20"/>
               </w:rPr>
@@ -992,12 +818,11 @@
           <w:tcPr>
             <w:tcW w:type="dxa" w:w="3000"/>
             <w:tcBorders>
-              <w:top w:val="single" w:color="B8C0AE" w:sz="4"/>
-              <w:left w:val="single" w:color="B8C0AE" w:sz="4"/>
-              <w:bottom w:val="single" w:color="B8C0AE" w:sz="4"/>
-              <w:right w:val="single" w:color="B8C0AE" w:sz="4"/>
-            </w:tcBorders>
-            <w:shd w:fill="2F4A2C" w:color="auto" w:val="clear"/>
+              <w:top w:val="single" w:color="000000" w:sz="4"/>
+              <w:left w:val="single" w:color="000000" w:sz="4"/>
+              <w:bottom w:val="single" w:color="000000" w:sz="4"/>
+              <w:right w:val="single" w:color="000000" w:sz="4"/>
+            </w:tcBorders>
             <w:tcMar>
               <w:top w:type="dxa" w:w="70"/>
               <w:left w:type="dxa" w:w="100"/>
@@ -1014,11 +839,10 @@
                 <w:rFonts w:ascii="Arial" w:cs="Arial" w:eastAsia="Arial" w:hAnsi="Arial"/>
                 <w:b/>
                 <w:bCs/>
-                <w:color w:val="FFFFFF"/>
-                <w:sz w:val="20"/>
-                <w:szCs w:val="20"/>
-              </w:rPr>
-              <w:t xml:space="preserve">Information demandée</w:t>
+                <w:sz w:val="20"/>
+                <w:szCs w:val="20"/>
+              </w:rPr>
+              <w:t xml:space="preserve">Information</w:t>
             </w:r>
           </w:p>
         </w:tc>
@@ -1026,12 +850,11 @@
           <w:tcPr>
             <w:tcW w:type="dxa" w:w="5800"/>
             <w:tcBorders>
-              <w:top w:val="single" w:color="B8C0AE" w:sz="4"/>
-              <w:left w:val="single" w:color="B8C0AE" w:sz="4"/>
-              <w:bottom w:val="single" w:color="B8C0AE" w:sz="4"/>
-              <w:right w:val="single" w:color="B8C0AE" w:sz="4"/>
-            </w:tcBorders>
-            <w:shd w:fill="2F4A2C" w:color="auto" w:val="clear"/>
+              <w:top w:val="single" w:color="000000" w:sz="4"/>
+              <w:left w:val="single" w:color="000000" w:sz="4"/>
+              <w:bottom w:val="single" w:color="000000" w:sz="4"/>
+              <w:right w:val="single" w:color="000000" w:sz="4"/>
+            </w:tcBorders>
             <w:tcMar>
               <w:top w:type="dxa" w:w="70"/>
               <w:left w:type="dxa" w:w="100"/>
@@ -1048,11 +871,10 @@
                 <w:rFonts w:ascii="Arial" w:cs="Arial" w:eastAsia="Arial" w:hAnsi="Arial"/>
                 <w:b/>
                 <w:bCs/>
-                <w:color w:val="FFFFFF"/>
-                <w:sz w:val="20"/>
-                <w:szCs w:val="20"/>
-              </w:rPr>
-              <w:t xml:space="preserve">Ce que nous savons / notre proposition</w:t>
+                <w:sz w:val="20"/>
+                <w:szCs w:val="20"/>
+              </w:rPr>
+              <w:t xml:space="preserve">Ce que nous avons (ou proposons)</w:t>
             </w:r>
           </w:p>
         </w:tc>
@@ -1060,12 +882,11 @@
           <w:tcPr>
             <w:tcW w:type="dxa" w:w="5438"/>
             <w:tcBorders>
-              <w:top w:val="single" w:color="B8C0AE" w:sz="4"/>
-              <w:left w:val="single" w:color="B8C0AE" w:sz="4"/>
-              <w:bottom w:val="single" w:color="B8C0AE" w:sz="4"/>
-              <w:right w:val="single" w:color="B8C0AE" w:sz="4"/>
-            </w:tcBorders>
-            <w:shd w:fill="2F4A2C" w:color="auto" w:val="clear"/>
+              <w:top w:val="single" w:color="000000" w:sz="4"/>
+              <w:left w:val="single" w:color="000000" w:sz="4"/>
+              <w:bottom w:val="single" w:color="000000" w:sz="4"/>
+              <w:right w:val="single" w:color="000000" w:sz="4"/>
+            </w:tcBorders>
             <w:tcMar>
               <w:top w:type="dxa" w:w="70"/>
               <w:left w:type="dxa" w:w="100"/>
@@ -1082,11 +903,10 @@
                 <w:rFonts w:ascii="Arial" w:cs="Arial" w:eastAsia="Arial" w:hAnsi="Arial"/>
                 <w:b/>
                 <w:bCs/>
-                <w:color w:val="FFFFFF"/>
-                <w:sz w:val="20"/>
-                <w:szCs w:val="20"/>
-              </w:rPr>
-              <w:t xml:space="preserve">Correction du groupe (à remplir si différent)</w:t>
+                <w:sz w:val="20"/>
+                <w:szCs w:val="20"/>
+              </w:rPr>
+              <w:t xml:space="preserve">Correction du groupe (seulement si différent)</w:t>
             </w:r>
           </w:p>
         </w:tc>
@@ -1099,10 +919,10 @@
           <w:tcPr>
             <w:tcW w:type="dxa" w:w="600"/>
             <w:tcBorders>
-              <w:top w:val="single" w:color="B8C0AE" w:sz="4"/>
-              <w:left w:val="single" w:color="B8C0AE" w:sz="4"/>
-              <w:bottom w:val="single" w:color="B8C0AE" w:sz="4"/>
-              <w:right w:val="single" w:color="B8C0AE" w:sz="4"/>
+              <w:top w:val="single" w:color="000000" w:sz="4"/>
+              <w:left w:val="single" w:color="000000" w:sz="4"/>
+              <w:bottom w:val="single" w:color="000000" w:sz="4"/>
+              <w:right w:val="single" w:color="000000" w:sz="4"/>
             </w:tcBorders>
             <w:tcMar>
               <w:top w:type="dxa" w:w="70"/>
@@ -1129,10 +949,10 @@
           <w:tcPr>
             <w:tcW w:type="dxa" w:w="3000"/>
             <w:tcBorders>
-              <w:top w:val="single" w:color="B8C0AE" w:sz="4"/>
-              <w:left w:val="single" w:color="B8C0AE" w:sz="4"/>
-              <w:bottom w:val="single" w:color="B8C0AE" w:sz="4"/>
-              <w:right w:val="single" w:color="B8C0AE" w:sz="4"/>
+              <w:top w:val="single" w:color="000000" w:sz="4"/>
+              <w:left w:val="single" w:color="000000" w:sz="4"/>
+              <w:bottom w:val="single" w:color="000000" w:sz="4"/>
+              <w:right w:val="single" w:color="000000" w:sz="4"/>
             </w:tcBorders>
             <w:tcMar>
               <w:top w:type="dxa" w:w="70"/>
@@ -1161,30 +981,29 @@
           <w:tcPr>
             <w:tcW w:type="dxa" w:w="5800"/>
             <w:tcBorders>
-              <w:top w:val="single" w:color="B8C0AE" w:sz="4"/>
-              <w:left w:val="single" w:color="B8C0AE" w:sz="4"/>
-              <w:bottom w:val="single" w:color="B8C0AE" w:sz="4"/>
-              <w:right w:val="single" w:color="B8C0AE" w:sz="4"/>
-            </w:tcBorders>
-            <w:shd w:fill="EEF0E8" w:color="auto" w:val="clear"/>
-            <w:tcMar>
-              <w:top w:type="dxa" w:w="70"/>
-              <w:left w:type="dxa" w:w="100"/>
-              <w:bottom w:type="dxa" w:w="70"/>
-              <w:right w:type="dxa" w:w="100"/>
-            </w:tcMar>
-          </w:tcPr>
-          <w:p>
-            <w:pPr>
-              <w:spacing w:after="80"/>
-            </w:pPr>
-            <w:r>
-              <w:rPr>
-                <w:rFonts w:ascii="Arial" w:cs="Arial" w:eastAsia="Arial" w:hAnsi="Arial"/>
-                <w:sz w:val="20"/>
-                <w:szCs w:val="20"/>
-              </w:rPr>
-              <w:t xml:space="preserve">Non connus. Proposition : la personne qui coordonne le groupe (coordination, présidence ou équivalent). Merci d’indiquer son nom et sa fonction. Son nom sera affiché publiquement dans les mentions légales.</w:t>
+              <w:top w:val="single" w:color="000000" w:sz="4"/>
+              <w:left w:val="single" w:color="000000" w:sz="4"/>
+              <w:bottom w:val="single" w:color="000000" w:sz="4"/>
+              <w:right w:val="single" w:color="000000" w:sz="4"/>
+            </w:tcBorders>
+            <w:tcMar>
+              <w:top w:type="dxa" w:w="70"/>
+              <w:left w:type="dxa" w:w="100"/>
+              <w:bottom w:type="dxa" w:w="70"/>
+              <w:right w:type="dxa" w:w="100"/>
+            </w:tcMar>
+          </w:tcPr>
+          <w:p>
+            <w:pPr>
+              <w:spacing w:after="80"/>
+            </w:pPr>
+            <w:r>
+              <w:rPr>
+                <w:rFonts w:ascii="Arial" w:cs="Arial" w:eastAsia="Arial" w:hAnsi="Arial"/>
+                <w:sz w:val="20"/>
+                <w:szCs w:val="20"/>
+              </w:rPr>
+              <w:t xml:space="preserve">Non connus. Proposition : la personne qui coordonne le groupe (coordination, présidence ou équivalent). Son nom sera affiché dans les mentions légales du site.</w:t>
             </w:r>
           </w:p>
         </w:tc>
@@ -1192,12 +1011,11 @@
           <w:tcPr>
             <w:tcW w:type="dxa" w:w="5438"/>
             <w:tcBorders>
-              <w:top w:val="single" w:color="B8C0AE" w:sz="4"/>
-              <w:left w:val="single" w:color="B8C0AE" w:sz="4"/>
-              <w:bottom w:val="single" w:color="B8C0AE" w:sz="4"/>
-              <w:right w:val="single" w:color="B8C0AE" w:sz="4"/>
-            </w:tcBorders>
-            <w:shd w:fill="FFF3C4" w:color="auto" w:val="clear"/>
+              <w:top w:val="single" w:color="000000" w:sz="4"/>
+              <w:left w:val="single" w:color="000000" w:sz="4"/>
+              <w:bottom w:val="single" w:color="000000" w:sz="4"/>
+              <w:right w:val="single" w:color="000000" w:sz="4"/>
+            </w:tcBorders>
             <w:tcMar>
               <w:top w:type="dxa" w:w="70"/>
               <w:left w:type="dxa" w:w="100"/>
@@ -1232,11 +1050,10 @@
           <w:rFonts w:ascii="Arial" w:cs="Arial" w:eastAsia="Arial" w:hAnsi="Arial"/>
           <w:b/>
           <w:bCs/>
-          <w:color w:val="2F4A2C"/>
           <w:sz w:val="26"/>
           <w:szCs w:val="26"/>
         </w:rPr>
-        <w:t xml:space="preserve">3. Hébergeur du site</w:t>
+        <w:t xml:space="preserve">3. Protection des données personnelles</w:t>
       </w:r>
     </w:p>
     <w:tbl>
@@ -1265,12 +1082,11 @@
           <w:tcPr>
             <w:tcW w:type="dxa" w:w="600"/>
             <w:tcBorders>
-              <w:top w:val="single" w:color="B8C0AE" w:sz="4"/>
-              <w:left w:val="single" w:color="B8C0AE" w:sz="4"/>
-              <w:bottom w:val="single" w:color="B8C0AE" w:sz="4"/>
-              <w:right w:val="single" w:color="B8C0AE" w:sz="4"/>
-            </w:tcBorders>
-            <w:shd w:fill="2F4A2C" w:color="auto" w:val="clear"/>
+              <w:top w:val="single" w:color="000000" w:sz="4"/>
+              <w:left w:val="single" w:color="000000" w:sz="4"/>
+              <w:bottom w:val="single" w:color="000000" w:sz="4"/>
+              <w:right w:val="single" w:color="000000" w:sz="4"/>
+            </w:tcBorders>
             <w:tcMar>
               <w:top w:type="dxa" w:w="70"/>
               <w:left w:type="dxa" w:w="100"/>
@@ -1287,7 +1103,6 @@
                 <w:rFonts w:ascii="Arial" w:cs="Arial" w:eastAsia="Arial" w:hAnsi="Arial"/>
                 <w:b/>
                 <w:bCs/>
-                <w:color w:val="FFFFFF"/>
                 <w:sz w:val="20"/>
                 <w:szCs w:val="20"/>
               </w:rPr>
@@ -1299,12 +1114,11 @@
           <w:tcPr>
             <w:tcW w:type="dxa" w:w="3000"/>
             <w:tcBorders>
-              <w:top w:val="single" w:color="B8C0AE" w:sz="4"/>
-              <w:left w:val="single" w:color="B8C0AE" w:sz="4"/>
-              <w:bottom w:val="single" w:color="B8C0AE" w:sz="4"/>
-              <w:right w:val="single" w:color="B8C0AE" w:sz="4"/>
-            </w:tcBorders>
-            <w:shd w:fill="2F4A2C" w:color="auto" w:val="clear"/>
+              <w:top w:val="single" w:color="000000" w:sz="4"/>
+              <w:left w:val="single" w:color="000000" w:sz="4"/>
+              <w:bottom w:val="single" w:color="000000" w:sz="4"/>
+              <w:right w:val="single" w:color="000000" w:sz="4"/>
+            </w:tcBorders>
             <w:tcMar>
               <w:top w:type="dxa" w:w="70"/>
               <w:left w:type="dxa" w:w="100"/>
@@ -1321,11 +1135,10 @@
                 <w:rFonts w:ascii="Arial" w:cs="Arial" w:eastAsia="Arial" w:hAnsi="Arial"/>
                 <w:b/>
                 <w:bCs/>
-                <w:color w:val="FFFFFF"/>
-                <w:sz w:val="20"/>
-                <w:szCs w:val="20"/>
-              </w:rPr>
-              <w:t xml:space="preserve">Information demandée</w:t>
+                <w:sz w:val="20"/>
+                <w:szCs w:val="20"/>
+              </w:rPr>
+              <w:t xml:space="preserve">Information</w:t>
             </w:r>
           </w:p>
         </w:tc>
@@ -1333,12 +1146,11 @@
           <w:tcPr>
             <w:tcW w:type="dxa" w:w="5800"/>
             <w:tcBorders>
-              <w:top w:val="single" w:color="B8C0AE" w:sz="4"/>
-              <w:left w:val="single" w:color="B8C0AE" w:sz="4"/>
-              <w:bottom w:val="single" w:color="B8C0AE" w:sz="4"/>
-              <w:right w:val="single" w:color="B8C0AE" w:sz="4"/>
-            </w:tcBorders>
-            <w:shd w:fill="2F4A2C" w:color="auto" w:val="clear"/>
+              <w:top w:val="single" w:color="000000" w:sz="4"/>
+              <w:left w:val="single" w:color="000000" w:sz="4"/>
+              <w:bottom w:val="single" w:color="000000" w:sz="4"/>
+              <w:right w:val="single" w:color="000000" w:sz="4"/>
+            </w:tcBorders>
             <w:tcMar>
               <w:top w:type="dxa" w:w="70"/>
               <w:left w:type="dxa" w:w="100"/>
@@ -1355,11 +1167,10 @@
                 <w:rFonts w:ascii="Arial" w:cs="Arial" w:eastAsia="Arial" w:hAnsi="Arial"/>
                 <w:b/>
                 <w:bCs/>
-                <w:color w:val="FFFFFF"/>
-                <w:sz w:val="20"/>
-                <w:szCs w:val="20"/>
-              </w:rPr>
-              <w:t xml:space="preserve">Ce que nous savons / notre proposition</w:t>
+                <w:sz w:val="20"/>
+                <w:szCs w:val="20"/>
+              </w:rPr>
+              <w:t xml:space="preserve">Ce que nous avons (ou proposons)</w:t>
             </w:r>
           </w:p>
         </w:tc>
@@ -1367,12 +1178,11 @@
           <w:tcPr>
             <w:tcW w:type="dxa" w:w="5438"/>
             <w:tcBorders>
-              <w:top w:val="single" w:color="B8C0AE" w:sz="4"/>
-              <w:left w:val="single" w:color="B8C0AE" w:sz="4"/>
-              <w:bottom w:val="single" w:color="B8C0AE" w:sz="4"/>
-              <w:right w:val="single" w:color="B8C0AE" w:sz="4"/>
-            </w:tcBorders>
-            <w:shd w:fill="2F4A2C" w:color="auto" w:val="clear"/>
+              <w:top w:val="single" w:color="000000" w:sz="4"/>
+              <w:left w:val="single" w:color="000000" w:sz="4"/>
+              <w:bottom w:val="single" w:color="000000" w:sz="4"/>
+              <w:right w:val="single" w:color="000000" w:sz="4"/>
+            </w:tcBorders>
             <w:tcMar>
               <w:top w:type="dxa" w:w="70"/>
               <w:left w:type="dxa" w:w="100"/>
@@ -1389,11 +1199,10 @@
                 <w:rFonts w:ascii="Arial" w:cs="Arial" w:eastAsia="Arial" w:hAnsi="Arial"/>
                 <w:b/>
                 <w:bCs/>
-                <w:color w:val="FFFFFF"/>
-                <w:sz w:val="20"/>
-                <w:szCs w:val="20"/>
-              </w:rPr>
-              <w:t xml:space="preserve">Correction du groupe (à remplir si différent)</w:t>
+                <w:sz w:val="20"/>
+                <w:szCs w:val="20"/>
+              </w:rPr>
+              <w:t xml:space="preserve">Correction du groupe (seulement si différent)</w:t>
             </w:r>
           </w:p>
         </w:tc>
@@ -1406,10 +1215,10 @@
           <w:tcPr>
             <w:tcW w:type="dxa" w:w="600"/>
             <w:tcBorders>
-              <w:top w:val="single" w:color="B8C0AE" w:sz="4"/>
-              <w:left w:val="single" w:color="B8C0AE" w:sz="4"/>
-              <w:bottom w:val="single" w:color="B8C0AE" w:sz="4"/>
-              <w:right w:val="single" w:color="B8C0AE" w:sz="4"/>
+              <w:top w:val="single" w:color="000000" w:sz="4"/>
+              <w:left w:val="single" w:color="000000" w:sz="4"/>
+              <w:bottom w:val="single" w:color="000000" w:sz="4"/>
+              <w:right w:val="single" w:color="000000" w:sz="4"/>
             </w:tcBorders>
             <w:tcMar>
               <w:top w:type="dxa" w:w="70"/>
@@ -1436,10 +1245,10 @@
           <w:tcPr>
             <w:tcW w:type="dxa" w:w="3000"/>
             <w:tcBorders>
-              <w:top w:val="single" w:color="B8C0AE" w:sz="4"/>
-              <w:left w:val="single" w:color="B8C0AE" w:sz="4"/>
-              <w:bottom w:val="single" w:color="B8C0AE" w:sz="4"/>
-              <w:right w:val="single" w:color="B8C0AE" w:sz="4"/>
+              <w:top w:val="single" w:color="000000" w:sz="4"/>
+              <w:left w:val="single" w:color="000000" w:sz="4"/>
+              <w:bottom w:val="single" w:color="000000" w:sz="4"/>
+              <w:right w:val="single" w:color="000000" w:sz="4"/>
             </w:tcBorders>
             <w:tcMar>
               <w:top w:type="dxa" w:w="70"/>
@@ -1460,7 +1269,7 @@
                 <w:sz w:val="20"/>
                 <w:szCs w:val="20"/>
               </w:rPr>
-              <w:t xml:space="preserve">Nom de l’hébergeur</w:t>
+              <w:t xml:space="preserve">Démarche auprès de l’APDP</w:t>
             </w:r>
           </w:p>
         </w:tc>
@@ -1468,30 +1277,29 @@
           <w:tcPr>
             <w:tcW w:type="dxa" w:w="5800"/>
             <w:tcBorders>
-              <w:top w:val="single" w:color="B8C0AE" w:sz="4"/>
-              <w:left w:val="single" w:color="B8C0AE" w:sz="4"/>
-              <w:bottom w:val="single" w:color="B8C0AE" w:sz="4"/>
-              <w:right w:val="single" w:color="B8C0AE" w:sz="4"/>
-            </w:tcBorders>
-            <w:shd w:fill="EEF0E8" w:color="auto" w:val="clear"/>
-            <w:tcMar>
-              <w:top w:type="dxa" w:w="70"/>
-              <w:left w:type="dxa" w:w="100"/>
-              <w:bottom w:type="dxa" w:w="70"/>
-              <w:right w:type="dxa" w:w="100"/>
-            </w:tcMar>
-          </w:tcPr>
-          <w:p>
-            <w:pPr>
-              <w:spacing w:after="80"/>
-            </w:pPr>
-            <w:r>
-              <w:rPr>
-                <w:rFonts w:ascii="Arial" w:cs="Arial" w:eastAsia="Arial" w:hAnsi="Arial"/>
-                <w:sz w:val="20"/>
-                <w:szCs w:val="20"/>
-              </w:rPr>
-              <w:t xml:space="preserve">LWS (Ligne Web Services), société française.</w:t>
+              <w:top w:val="single" w:color="000000" w:sz="4"/>
+              <w:left w:val="single" w:color="000000" w:sz="4"/>
+              <w:bottom w:val="single" w:color="000000" w:sz="4"/>
+              <w:right w:val="single" w:color="000000" w:sz="4"/>
+            </w:tcBorders>
+            <w:tcMar>
+              <w:top w:type="dxa" w:w="70"/>
+              <w:left w:type="dxa" w:w="100"/>
+              <w:bottom w:type="dxa" w:w="70"/>
+              <w:right w:type="dxa" w:w="100"/>
+            </w:tcMar>
+          </w:tcPr>
+          <w:p>
+            <w:pPr>
+              <w:spacing w:after="80"/>
+            </w:pPr>
+            <w:r>
+              <w:rPr>
+                <w:rFonts w:ascii="Arial" w:cs="Arial" w:eastAsia="Arial" w:hAnsi="Arial"/>
+                <w:sz w:val="20"/>
+                <w:szCs w:val="20"/>
+              </w:rPr>
+              <w:t xml:space="preserve">Si le groupe a déjà fait une démarche auprès de l’APDP (l’autorité malienne de protection des données), indiquer le numéro de récépissé. Sinon, laisser vide.</w:t>
             </w:r>
           </w:p>
         </w:tc>
@@ -1499,12 +1307,11 @@
           <w:tcPr>
             <w:tcW w:type="dxa" w:w="5438"/>
             <w:tcBorders>
-              <w:top w:val="single" w:color="B8C0AE" w:sz="4"/>
-              <w:left w:val="single" w:color="B8C0AE" w:sz="4"/>
-              <w:bottom w:val="single" w:color="B8C0AE" w:sz="4"/>
-              <w:right w:val="single" w:color="B8C0AE" w:sz="4"/>
-            </w:tcBorders>
-            <w:shd w:fill="FFF3C4" w:color="auto" w:val="clear"/>
+              <w:top w:val="single" w:color="000000" w:sz="4"/>
+              <w:left w:val="single" w:color="000000" w:sz="4"/>
+              <w:bottom w:val="single" w:color="000000" w:sz="4"/>
+              <w:right w:val="single" w:color="000000" w:sz="4"/>
+            </w:tcBorders>
             <w:tcMar>
               <w:top w:type="dxa" w:w="70"/>
               <w:left w:type="dxa" w:w="100"/>
@@ -1535,10 +1342,10 @@
           <w:tcPr>
             <w:tcW w:type="dxa" w:w="600"/>
             <w:tcBorders>
-              <w:top w:val="single" w:color="B8C0AE" w:sz="4"/>
-              <w:left w:val="single" w:color="B8C0AE" w:sz="4"/>
-              <w:bottom w:val="single" w:color="B8C0AE" w:sz="4"/>
-              <w:right w:val="single" w:color="B8C0AE" w:sz="4"/>
+              <w:top w:val="single" w:color="000000" w:sz="4"/>
+              <w:left w:val="single" w:color="000000" w:sz="4"/>
+              <w:bottom w:val="single" w:color="000000" w:sz="4"/>
+              <w:right w:val="single" w:color="000000" w:sz="4"/>
             </w:tcBorders>
             <w:tcMar>
               <w:top w:type="dxa" w:w="70"/>
@@ -1565,10 +1372,10 @@
           <w:tcPr>
             <w:tcW w:type="dxa" w:w="3000"/>
             <w:tcBorders>
-              <w:top w:val="single" w:color="B8C0AE" w:sz="4"/>
-              <w:left w:val="single" w:color="B8C0AE" w:sz="4"/>
-              <w:bottom w:val="single" w:color="B8C0AE" w:sz="4"/>
-              <w:right w:val="single" w:color="B8C0AE" w:sz="4"/>
+              <w:top w:val="single" w:color="000000" w:sz="4"/>
+              <w:left w:val="single" w:color="000000" w:sz="4"/>
+              <w:bottom w:val="single" w:color="000000" w:sz="4"/>
+              <w:right w:val="single" w:color="000000" w:sz="4"/>
             </w:tcBorders>
             <w:tcMar>
               <w:top w:type="dxa" w:w="70"/>
@@ -1589,7 +1396,7 @@
                 <w:sz w:val="20"/>
                 <w:szCs w:val="20"/>
               </w:rPr>
-              <w:t xml:space="preserve">Adresse et contact de l’hébergeur</w:t>
+              <w:t xml:space="preserve">Personne qui reçoit les demandes des internautes sur leurs données</w:t>
             </w:r>
           </w:p>
         </w:tc>
@@ -1597,45 +1404,29 @@
           <w:tcPr>
             <w:tcW w:type="dxa" w:w="5800"/>
             <w:tcBorders>
-              <w:top w:val="single" w:color="B8C0AE" w:sz="4"/>
-              <w:left w:val="single" w:color="B8C0AE" w:sz="4"/>
-              <w:bottom w:val="single" w:color="B8C0AE" w:sz="4"/>
-              <w:right w:val="single" w:color="B8C0AE" w:sz="4"/>
-            </w:tcBorders>
-            <w:shd w:fill="EEF0E8" w:color="auto" w:val="clear"/>
-            <w:tcMar>
-              <w:top w:type="dxa" w:w="70"/>
-              <w:left w:type="dxa" w:w="100"/>
-              <w:bottom w:type="dxa" w:w="70"/>
-              <w:right w:type="dxa" w:w="100"/>
-            </w:tcMar>
-          </w:tcPr>
-          <w:p>
-            <w:pPr>
-              <w:spacing w:after="80"/>
-            </w:pPr>
-            <w:r>
-              <w:rPr>
-                <w:rFonts w:ascii="Arial" w:cs="Arial" w:eastAsia="Arial" w:hAnsi="Arial"/>
-                <w:sz w:val="20"/>
-                <w:szCs w:val="20"/>
-              </w:rPr>
-              <w:t xml:space="preserve">Proposition : 10 rue de Penthièvre, 75008 Paris, France · Téléphone : +33 1 77 62 30 03 · Site : www.lws.fr.</w:t>
-            </w:r>
-          </w:p>
-          <w:p>
-            <w:pPr>
-              <w:spacing w:after="80"/>
-            </w:pPr>
-            <w:r>
-              <w:rPr>
-                <w:rFonts w:ascii="Arial" w:cs="Arial" w:eastAsia="Arial" w:hAnsi="Arial"/>
-                <w:i/>
-                <w:iCs/>
-                <w:sz w:val="20"/>
-                <w:szCs w:val="20"/>
-              </w:rPr>
-              <w:t xml:space="preserve">À vérifier par le groupe sur les mentions légales du site lws.fr avant publication : ces coordonnées sont données de mémoire.</w:t>
+              <w:top w:val="single" w:color="000000" w:sz="4"/>
+              <w:left w:val="single" w:color="000000" w:sz="4"/>
+              <w:bottom w:val="single" w:color="000000" w:sz="4"/>
+              <w:right w:val="single" w:color="000000" w:sz="4"/>
+            </w:tcBorders>
+            <w:tcMar>
+              <w:top w:type="dxa" w:w="70"/>
+              <w:left w:type="dxa" w:w="100"/>
+              <w:bottom w:type="dxa" w:w="70"/>
+              <w:right w:type="dxa" w:w="100"/>
+            </w:tcMar>
+          </w:tcPr>
+          <w:p>
+            <w:pPr>
+              <w:spacing w:after="80"/>
+            </w:pPr>
+            <w:r>
+              <w:rPr>
+                <w:rFonts w:ascii="Arial" w:cs="Arial" w:eastAsia="Arial" w:hAnsi="Arial"/>
+                <w:sz w:val="20"/>
+                <w:szCs w:val="20"/>
+              </w:rPr>
+              <w:t xml:space="preserve">Info@zabantu.net. Proposition : nommer une personne du groupe chargée de répondre. Nom :</w:t>
             </w:r>
           </w:p>
         </w:tc>
@@ -1643,12 +1434,11 @@
           <w:tcPr>
             <w:tcW w:type="dxa" w:w="5438"/>
             <w:tcBorders>
-              <w:top w:val="single" w:color="B8C0AE" w:sz="4"/>
-              <w:left w:val="single" w:color="B8C0AE" w:sz="4"/>
-              <w:bottom w:val="single" w:color="B8C0AE" w:sz="4"/>
-              <w:right w:val="single" w:color="B8C0AE" w:sz="4"/>
-            </w:tcBorders>
-            <w:shd w:fill="FFF3C4" w:color="auto" w:val="clear"/>
+              <w:top w:val="single" w:color="000000" w:sz="4"/>
+              <w:left w:val="single" w:color="000000" w:sz="4"/>
+              <w:bottom w:val="single" w:color="000000" w:sz="4"/>
+              <w:right w:val="single" w:color="000000" w:sz="4"/>
+            </w:tcBorders>
             <w:tcMar>
               <w:top w:type="dxa" w:w="70"/>
               <w:left w:type="dxa" w:w="100"/>
@@ -1679,10 +1469,10 @@
           <w:tcPr>
             <w:tcW w:type="dxa" w:w="600"/>
             <w:tcBorders>
-              <w:top w:val="single" w:color="B8C0AE" w:sz="4"/>
-              <w:left w:val="single" w:color="B8C0AE" w:sz="4"/>
-              <w:bottom w:val="single" w:color="B8C0AE" w:sz="4"/>
-              <w:right w:val="single" w:color="B8C0AE" w:sz="4"/>
+              <w:top w:val="single" w:color="000000" w:sz="4"/>
+              <w:left w:val="single" w:color="000000" w:sz="4"/>
+              <w:bottom w:val="single" w:color="000000" w:sz="4"/>
+              <w:right w:val="single" w:color="000000" w:sz="4"/>
             </w:tcBorders>
             <w:tcMar>
               <w:top w:type="dxa" w:w="70"/>
@@ -1709,10 +1499,10 @@
           <w:tcPr>
             <w:tcW w:type="dxa" w:w="3000"/>
             <w:tcBorders>
-              <w:top w:val="single" w:color="B8C0AE" w:sz="4"/>
-              <w:left w:val="single" w:color="B8C0AE" w:sz="4"/>
-              <w:bottom w:val="single" w:color="B8C0AE" w:sz="4"/>
-              <w:right w:val="single" w:color="B8C0AE" w:sz="4"/>
+              <w:top w:val="single" w:color="000000" w:sz="4"/>
+              <w:left w:val="single" w:color="000000" w:sz="4"/>
+              <w:bottom w:val="single" w:color="000000" w:sz="4"/>
+              <w:right w:val="single" w:color="000000" w:sz="4"/>
             </w:tcBorders>
             <w:tcMar>
               <w:top w:type="dxa" w:w="70"/>
@@ -1733,7 +1523,7 @@
                 <w:sz w:val="20"/>
                 <w:szCs w:val="20"/>
               </w:rPr>
-              <w:t xml:space="preserve">Pays d’hébergement des données</w:t>
+              <w:t xml:space="preserve">Délai de réponse à ces demandes</w:t>
             </w:r>
           </w:p>
         </w:tc>
@@ -1741,30 +1531,29 @@
           <w:tcPr>
             <w:tcW w:type="dxa" w:w="5800"/>
             <w:tcBorders>
-              <w:top w:val="single" w:color="B8C0AE" w:sz="4"/>
-              <w:left w:val="single" w:color="B8C0AE" w:sz="4"/>
-              <w:bottom w:val="single" w:color="B8C0AE" w:sz="4"/>
-              <w:right w:val="single" w:color="B8C0AE" w:sz="4"/>
-            </w:tcBorders>
-            <w:shd w:fill="EEF0E8" w:color="auto" w:val="clear"/>
-            <w:tcMar>
-              <w:top w:type="dxa" w:w="70"/>
-              <w:left w:type="dxa" w:w="100"/>
-              <w:bottom w:type="dxa" w:w="70"/>
-              <w:right w:type="dxa" w:w="100"/>
-            </w:tcMar>
-          </w:tcPr>
-          <w:p>
-            <w:pPr>
-              <w:spacing w:after="80"/>
-            </w:pPr>
-            <w:r>
-              <w:rPr>
-                <w:rFonts w:ascii="Arial" w:cs="Arial" w:eastAsia="Arial" w:hAnsi="Arial"/>
-                <w:sz w:val="20"/>
-                <w:szCs w:val="20"/>
-              </w:rPr>
-              <w:t xml:space="preserve">France. Les données des formulaires, des comptes et de l’info-lettre sont donc stockées en France, donc hors du Mali.</w:t>
+              <w:top w:val="single" w:color="000000" w:sz="4"/>
+              <w:left w:val="single" w:color="000000" w:sz="4"/>
+              <w:bottom w:val="single" w:color="000000" w:sz="4"/>
+              <w:right w:val="single" w:color="000000" w:sz="4"/>
+            </w:tcBorders>
+            <w:tcMar>
+              <w:top w:type="dxa" w:w="70"/>
+              <w:left w:type="dxa" w:w="100"/>
+              <w:bottom w:type="dxa" w:w="70"/>
+              <w:right w:type="dxa" w:w="100"/>
+            </w:tcMar>
+          </w:tcPr>
+          <w:p>
+            <w:pPr>
+              <w:spacing w:after="80"/>
+            </w:pPr>
+            <w:r>
+              <w:rPr>
+                <w:rFonts w:ascii="Arial" w:cs="Arial" w:eastAsia="Arial" w:hAnsi="Arial"/>
+                <w:sz w:val="20"/>
+                <w:szCs w:val="20"/>
+              </w:rPr>
+              <w:t xml:space="preserve">Proposition : un mois.</w:t>
             </w:r>
           </w:p>
         </w:tc>
@@ -1772,12 +1561,11 @@
           <w:tcPr>
             <w:tcW w:type="dxa" w:w="5438"/>
             <w:tcBorders>
-              <w:top w:val="single" w:color="B8C0AE" w:sz="4"/>
-              <w:left w:val="single" w:color="B8C0AE" w:sz="4"/>
-              <w:bottom w:val="single" w:color="B8C0AE" w:sz="4"/>
-              <w:right w:val="single" w:color="B8C0AE" w:sz="4"/>
-            </w:tcBorders>
-            <w:shd w:fill="FFF3C4" w:color="auto" w:val="clear"/>
+              <w:top w:val="single" w:color="000000" w:sz="4"/>
+              <w:left w:val="single" w:color="000000" w:sz="4"/>
+              <w:bottom w:val="single" w:color="000000" w:sz="4"/>
+              <w:right w:val="single" w:color="000000" w:sz="4"/>
+            </w:tcBorders>
             <w:tcMar>
               <w:top w:type="dxa" w:w="70"/>
               <w:left w:type="dxa" w:w="100"/>
@@ -1808,10 +1596,10 @@
           <w:tcPr>
             <w:tcW w:type="dxa" w:w="600"/>
             <w:tcBorders>
-              <w:top w:val="single" w:color="B8C0AE" w:sz="4"/>
-              <w:left w:val="single" w:color="B8C0AE" w:sz="4"/>
-              <w:bottom w:val="single" w:color="B8C0AE" w:sz="4"/>
-              <w:right w:val="single" w:color="B8C0AE" w:sz="4"/>
+              <w:top w:val="single" w:color="000000" w:sz="4"/>
+              <w:left w:val="single" w:color="000000" w:sz="4"/>
+              <w:bottom w:val="single" w:color="000000" w:sz="4"/>
+              <w:right w:val="single" w:color="000000" w:sz="4"/>
             </w:tcBorders>
             <w:tcMar>
               <w:top w:type="dxa" w:w="70"/>
@@ -1838,10 +1626,10 @@
           <w:tcPr>
             <w:tcW w:type="dxa" w:w="3000"/>
             <w:tcBorders>
-              <w:top w:val="single" w:color="B8C0AE" w:sz="4"/>
-              <w:left w:val="single" w:color="B8C0AE" w:sz="4"/>
-              <w:bottom w:val="single" w:color="B8C0AE" w:sz="4"/>
-              <w:right w:val="single" w:color="B8C0AE" w:sz="4"/>
+              <w:top w:val="single" w:color="000000" w:sz="4"/>
+              <w:left w:val="single" w:color="000000" w:sz="4"/>
+              <w:bottom w:val="single" w:color="000000" w:sz="4"/>
+              <w:right w:val="single" w:color="000000" w:sz="4"/>
             </w:tcBorders>
             <w:tcMar>
               <w:top w:type="dxa" w:w="70"/>
@@ -1862,7 +1650,7 @@
                 <w:sz w:val="20"/>
                 <w:szCs w:val="20"/>
               </w:rPr>
-              <w:t xml:space="preserve">Messagerie (mail.zabantu.net)</w:t>
+              <w:t xml:space="preserve">Personnes qui ont accès aux données</w:t>
             </w:r>
           </w:p>
         </w:tc>
@@ -1870,30 +1658,29 @@
           <w:tcPr>
             <w:tcW w:type="dxa" w:w="5800"/>
             <w:tcBorders>
-              <w:top w:val="single" w:color="B8C0AE" w:sz="4"/>
-              <w:left w:val="single" w:color="B8C0AE" w:sz="4"/>
-              <w:bottom w:val="single" w:color="B8C0AE" w:sz="4"/>
-              <w:right w:val="single" w:color="B8C0AE" w:sz="4"/>
-            </w:tcBorders>
-            <w:shd w:fill="EEF0E8" w:color="auto" w:val="clear"/>
-            <w:tcMar>
-              <w:top w:type="dxa" w:w="70"/>
-              <w:left w:type="dxa" w:w="100"/>
-              <w:bottom w:type="dxa" w:w="70"/>
-              <w:right w:type="dxa" w:w="100"/>
-            </w:tcMar>
-          </w:tcPr>
-          <w:p>
-            <w:pPr>
-              <w:spacing w:after="80"/>
-            </w:pPr>
-            <w:r>
-              <w:rPr>
-                <w:rFonts w:ascii="Arial" w:cs="Arial" w:eastAsia="Arial" w:hAnsi="Arial"/>
-                <w:sz w:val="20"/>
-                <w:szCs w:val="20"/>
-              </w:rPr>
-              <w:t xml:space="preserve">Nous supposons que les e-mails sont aussi gérés chez LWS. Est-ce exact ? Sinon, quel est le prestataire ?</w:t>
+              <w:top w:val="single" w:color="000000" w:sz="4"/>
+              <w:left w:val="single" w:color="000000" w:sz="4"/>
+              <w:bottom w:val="single" w:color="000000" w:sz="4"/>
+              <w:right w:val="single" w:color="000000" w:sz="4"/>
+            </w:tcBorders>
+            <w:tcMar>
+              <w:top w:type="dxa" w:w="70"/>
+              <w:left w:type="dxa" w:w="100"/>
+              <w:bottom w:type="dxa" w:w="70"/>
+              <w:right w:type="dxa" w:w="100"/>
+            </w:tcMar>
+          </w:tcPr>
+          <w:p>
+            <w:pPr>
+              <w:spacing w:after="80"/>
+            </w:pPr>
+            <w:r>
+              <w:rPr>
+                <w:rFonts w:ascii="Arial" w:cs="Arial" w:eastAsia="Arial" w:hAnsi="Arial"/>
+                <w:sz w:val="20"/>
+                <w:szCs w:val="20"/>
+              </w:rPr>
+              <w:t xml:space="preserve">Les administrateurs et modérateurs du site, et l’hébergeur du site. Y a-t-il d’autres personnes ?</w:t>
             </w:r>
           </w:p>
         </w:tc>
@@ -1901,12 +1688,11 @@
           <w:tcPr>
             <w:tcW w:type="dxa" w:w="5438"/>
             <w:tcBorders>
-              <w:top w:val="single" w:color="B8C0AE" w:sz="4"/>
-              <w:left w:val="single" w:color="B8C0AE" w:sz="4"/>
-              <w:bottom w:val="single" w:color="B8C0AE" w:sz="4"/>
-              <w:right w:val="single" w:color="B8C0AE" w:sz="4"/>
-            </w:tcBorders>
-            <w:shd w:fill="FFF3C4" w:color="auto" w:val="clear"/>
+              <w:top w:val="single" w:color="000000" w:sz="4"/>
+              <w:left w:val="single" w:color="000000" w:sz="4"/>
+              <w:bottom w:val="single" w:color="000000" w:sz="4"/>
+              <w:right w:val="single" w:color="000000" w:sz="4"/>
+            </w:tcBorders>
             <w:tcMar>
               <w:top w:type="dxa" w:w="70"/>
               <w:left w:type="dxa" w:w="100"/>
@@ -1941,11 +1727,10 @@
           <w:rFonts w:ascii="Arial" w:cs="Arial" w:eastAsia="Arial" w:hAnsi="Arial"/>
           <w:b/>
           <w:bCs/>
-          <w:color w:val="2F4A2C"/>
           <w:sz w:val="26"/>
           <w:szCs w:val="26"/>
         </w:rPr>
-        <w:t xml:space="preserve">4. Protection des données personnelles</w:t>
+        <w:t xml:space="preserve">4. Durées de conservation des données</w:t>
       </w:r>
     </w:p>
     <w:tbl>
@@ -1974,12 +1759,11 @@
           <w:tcPr>
             <w:tcW w:type="dxa" w:w="600"/>
             <w:tcBorders>
-              <w:top w:val="single" w:color="B8C0AE" w:sz="4"/>
-              <w:left w:val="single" w:color="B8C0AE" w:sz="4"/>
-              <w:bottom w:val="single" w:color="B8C0AE" w:sz="4"/>
-              <w:right w:val="single" w:color="B8C0AE" w:sz="4"/>
-            </w:tcBorders>
-            <w:shd w:fill="2F4A2C" w:color="auto" w:val="clear"/>
+              <w:top w:val="single" w:color="000000" w:sz="4"/>
+              <w:left w:val="single" w:color="000000" w:sz="4"/>
+              <w:bottom w:val="single" w:color="000000" w:sz="4"/>
+              <w:right w:val="single" w:color="000000" w:sz="4"/>
+            </w:tcBorders>
             <w:tcMar>
               <w:top w:type="dxa" w:w="70"/>
               <w:left w:type="dxa" w:w="100"/>
@@ -1996,7 +1780,6 @@
                 <w:rFonts w:ascii="Arial" w:cs="Arial" w:eastAsia="Arial" w:hAnsi="Arial"/>
                 <w:b/>
                 <w:bCs/>
-                <w:color w:val="FFFFFF"/>
                 <w:sz w:val="20"/>
                 <w:szCs w:val="20"/>
               </w:rPr>
@@ -2008,12 +1791,11 @@
           <w:tcPr>
             <w:tcW w:type="dxa" w:w="3000"/>
             <w:tcBorders>
-              <w:top w:val="single" w:color="B8C0AE" w:sz="4"/>
-              <w:left w:val="single" w:color="B8C0AE" w:sz="4"/>
-              <w:bottom w:val="single" w:color="B8C0AE" w:sz="4"/>
-              <w:right w:val="single" w:color="B8C0AE" w:sz="4"/>
-            </w:tcBorders>
-            <w:shd w:fill="2F4A2C" w:color="auto" w:val="clear"/>
+              <w:top w:val="single" w:color="000000" w:sz="4"/>
+              <w:left w:val="single" w:color="000000" w:sz="4"/>
+              <w:bottom w:val="single" w:color="000000" w:sz="4"/>
+              <w:right w:val="single" w:color="000000" w:sz="4"/>
+            </w:tcBorders>
             <w:tcMar>
               <w:top w:type="dxa" w:w="70"/>
               <w:left w:type="dxa" w:w="100"/>
@@ -2030,11 +1812,10 @@
                 <w:rFonts w:ascii="Arial" w:cs="Arial" w:eastAsia="Arial" w:hAnsi="Arial"/>
                 <w:b/>
                 <w:bCs/>
-                <w:color w:val="FFFFFF"/>
-                <w:sz w:val="20"/>
-                <w:szCs w:val="20"/>
-              </w:rPr>
-              <w:t xml:space="preserve">Information demandée</w:t>
+                <w:sz w:val="20"/>
+                <w:szCs w:val="20"/>
+              </w:rPr>
+              <w:t xml:space="preserve">Information</w:t>
             </w:r>
           </w:p>
         </w:tc>
@@ -2042,12 +1823,11 @@
           <w:tcPr>
             <w:tcW w:type="dxa" w:w="5800"/>
             <w:tcBorders>
-              <w:top w:val="single" w:color="B8C0AE" w:sz="4"/>
-              <w:left w:val="single" w:color="B8C0AE" w:sz="4"/>
-              <w:bottom w:val="single" w:color="B8C0AE" w:sz="4"/>
-              <w:right w:val="single" w:color="B8C0AE" w:sz="4"/>
-            </w:tcBorders>
-            <w:shd w:fill="2F4A2C" w:color="auto" w:val="clear"/>
+              <w:top w:val="single" w:color="000000" w:sz="4"/>
+              <w:left w:val="single" w:color="000000" w:sz="4"/>
+              <w:bottom w:val="single" w:color="000000" w:sz="4"/>
+              <w:right w:val="single" w:color="000000" w:sz="4"/>
+            </w:tcBorders>
             <w:tcMar>
               <w:top w:type="dxa" w:w="70"/>
               <w:left w:type="dxa" w:w="100"/>
@@ -2064,11 +1844,10 @@
                 <w:rFonts w:ascii="Arial" w:cs="Arial" w:eastAsia="Arial" w:hAnsi="Arial"/>
                 <w:b/>
                 <w:bCs/>
-                <w:color w:val="FFFFFF"/>
-                <w:sz w:val="20"/>
-                <w:szCs w:val="20"/>
-              </w:rPr>
-              <w:t xml:space="preserve">Ce que nous savons / notre proposition</w:t>
+                <w:sz w:val="20"/>
+                <w:szCs w:val="20"/>
+              </w:rPr>
+              <w:t xml:space="preserve">Ce que nous avons (ou proposons)</w:t>
             </w:r>
           </w:p>
         </w:tc>
@@ -2076,12 +1855,11 @@
           <w:tcPr>
             <w:tcW w:type="dxa" w:w="5438"/>
             <w:tcBorders>
-              <w:top w:val="single" w:color="B8C0AE" w:sz="4"/>
-              <w:left w:val="single" w:color="B8C0AE" w:sz="4"/>
-              <w:bottom w:val="single" w:color="B8C0AE" w:sz="4"/>
-              <w:right w:val="single" w:color="B8C0AE" w:sz="4"/>
-            </w:tcBorders>
-            <w:shd w:fill="2F4A2C" w:color="auto" w:val="clear"/>
+              <w:top w:val="single" w:color="000000" w:sz="4"/>
+              <w:left w:val="single" w:color="000000" w:sz="4"/>
+              <w:bottom w:val="single" w:color="000000" w:sz="4"/>
+              <w:right w:val="single" w:color="000000" w:sz="4"/>
+            </w:tcBorders>
             <w:tcMar>
               <w:top w:type="dxa" w:w="70"/>
               <w:left w:type="dxa" w:w="100"/>
@@ -2098,11 +1876,10 @@
                 <w:rFonts w:ascii="Arial" w:cs="Arial" w:eastAsia="Arial" w:hAnsi="Arial"/>
                 <w:b/>
                 <w:bCs/>
-                <w:color w:val="FFFFFF"/>
-                <w:sz w:val="20"/>
-                <w:szCs w:val="20"/>
-              </w:rPr>
-              <w:t xml:space="preserve">Correction du groupe (à remplir si différent)</w:t>
+                <w:sz w:val="20"/>
+                <w:szCs w:val="20"/>
+              </w:rPr>
+              <w:t xml:space="preserve">Correction du groupe (seulement si différent)</w:t>
             </w:r>
           </w:p>
         </w:tc>
@@ -2115,10 +1892,10 @@
           <w:tcPr>
             <w:tcW w:type="dxa" w:w="600"/>
             <w:tcBorders>
-              <w:top w:val="single" w:color="B8C0AE" w:sz="4"/>
-              <w:left w:val="single" w:color="B8C0AE" w:sz="4"/>
-              <w:bottom w:val="single" w:color="B8C0AE" w:sz="4"/>
-              <w:right w:val="single" w:color="B8C0AE" w:sz="4"/>
+              <w:top w:val="single" w:color="000000" w:sz="4"/>
+              <w:left w:val="single" w:color="000000" w:sz="4"/>
+              <w:bottom w:val="single" w:color="000000" w:sz="4"/>
+              <w:right w:val="single" w:color="000000" w:sz="4"/>
             </w:tcBorders>
             <w:tcMar>
               <w:top w:type="dxa" w:w="70"/>
@@ -2145,10 +1922,10 @@
           <w:tcPr>
             <w:tcW w:type="dxa" w:w="3000"/>
             <w:tcBorders>
-              <w:top w:val="single" w:color="B8C0AE" w:sz="4"/>
-              <w:left w:val="single" w:color="B8C0AE" w:sz="4"/>
-              <w:bottom w:val="single" w:color="B8C0AE" w:sz="4"/>
-              <w:right w:val="single" w:color="B8C0AE" w:sz="4"/>
+              <w:top w:val="single" w:color="000000" w:sz="4"/>
+              <w:left w:val="single" w:color="000000" w:sz="4"/>
+              <w:bottom w:val="single" w:color="000000" w:sz="4"/>
+              <w:right w:val="single" w:color="000000" w:sz="4"/>
             </w:tcBorders>
             <w:tcMar>
               <w:top w:type="dxa" w:w="70"/>
@@ -2169,7 +1946,7 @@
                 <w:sz w:val="20"/>
                 <w:szCs w:val="20"/>
               </w:rPr>
-              <w:t xml:space="preserve">Déclaration ou autorisation auprès de l’APDP</w:t>
+              <w:t xml:space="preserve">Messages du formulaire de contact</w:t>
             </w:r>
           </w:p>
         </w:tc>
@@ -2177,30 +1954,29 @@
           <w:tcPr>
             <w:tcW w:type="dxa" w:w="5800"/>
             <w:tcBorders>
-              <w:top w:val="single" w:color="B8C0AE" w:sz="4"/>
-              <w:left w:val="single" w:color="B8C0AE" w:sz="4"/>
-              <w:bottom w:val="single" w:color="B8C0AE" w:sz="4"/>
-              <w:right w:val="single" w:color="B8C0AE" w:sz="4"/>
-            </w:tcBorders>
-            <w:shd w:fill="EEF0E8" w:color="auto" w:val="clear"/>
-            <w:tcMar>
-              <w:top w:type="dxa" w:w="70"/>
-              <w:left w:type="dxa" w:w="100"/>
-              <w:bottom w:type="dxa" w:w="70"/>
-              <w:right w:type="dxa" w:w="100"/>
-            </w:tcMar>
-          </w:tcPr>
-          <w:p>
-            <w:pPr>
-              <w:spacing w:after="80"/>
-            </w:pPr>
-            <w:r>
-              <w:rPr>
-                <w:rFonts w:ascii="Arial" w:cs="Arial" w:eastAsia="Arial" w:hAnsi="Arial"/>
-                <w:sz w:val="20"/>
-                <w:szCs w:val="20"/>
-              </w:rPr>
-              <w:t xml:space="preserve">Non connue. Le groupe a-t-il déclaré (ou fait autoriser) ce traitement de données auprès de l’APDP du Mali ? Si oui, indiquer le numéro de récépissé et la date. Si non, à faire avant ou après la publication des pages.</w:t>
+              <w:top w:val="single" w:color="000000" w:sz="4"/>
+              <w:left w:val="single" w:color="000000" w:sz="4"/>
+              <w:bottom w:val="single" w:color="000000" w:sz="4"/>
+              <w:right w:val="single" w:color="000000" w:sz="4"/>
+            </w:tcBorders>
+            <w:tcMar>
+              <w:top w:type="dxa" w:w="70"/>
+              <w:left w:type="dxa" w:w="100"/>
+              <w:bottom w:type="dxa" w:w="70"/>
+              <w:right w:type="dxa" w:w="100"/>
+            </w:tcMar>
+          </w:tcPr>
+          <w:p>
+            <w:pPr>
+              <w:spacing w:after="80"/>
+            </w:pPr>
+            <w:r>
+              <w:rPr>
+                <w:rFonts w:ascii="Arial" w:cs="Arial" w:eastAsia="Arial" w:hAnsi="Arial"/>
+                <w:sz w:val="20"/>
+                <w:szCs w:val="20"/>
+              </w:rPr>
+              <w:t xml:space="preserve">Proposition : 3 ans après le dernier échange.</w:t>
             </w:r>
           </w:p>
         </w:tc>
@@ -2208,12 +1984,11 @@
           <w:tcPr>
             <w:tcW w:type="dxa" w:w="5438"/>
             <w:tcBorders>
-              <w:top w:val="single" w:color="B8C0AE" w:sz="4"/>
-              <w:left w:val="single" w:color="B8C0AE" w:sz="4"/>
-              <w:bottom w:val="single" w:color="B8C0AE" w:sz="4"/>
-              <w:right w:val="single" w:color="B8C0AE" w:sz="4"/>
-            </w:tcBorders>
-            <w:shd w:fill="FFF3C4" w:color="auto" w:val="clear"/>
+              <w:top w:val="single" w:color="000000" w:sz="4"/>
+              <w:left w:val="single" w:color="000000" w:sz="4"/>
+              <w:bottom w:val="single" w:color="000000" w:sz="4"/>
+              <w:right w:val="single" w:color="000000" w:sz="4"/>
+            </w:tcBorders>
             <w:tcMar>
               <w:top w:type="dxa" w:w="70"/>
               <w:left w:type="dxa" w:w="100"/>
@@ -2244,10 +2019,10 @@
           <w:tcPr>
             <w:tcW w:type="dxa" w:w="600"/>
             <w:tcBorders>
-              <w:top w:val="single" w:color="B8C0AE" w:sz="4"/>
-              <w:left w:val="single" w:color="B8C0AE" w:sz="4"/>
-              <w:bottom w:val="single" w:color="B8C0AE" w:sz="4"/>
-              <w:right w:val="single" w:color="B8C0AE" w:sz="4"/>
+              <w:top w:val="single" w:color="000000" w:sz="4"/>
+              <w:left w:val="single" w:color="000000" w:sz="4"/>
+              <w:bottom w:val="single" w:color="000000" w:sz="4"/>
+              <w:right w:val="single" w:color="000000" w:sz="4"/>
             </w:tcBorders>
             <w:tcMar>
               <w:top w:type="dxa" w:w="70"/>
@@ -2274,10 +2049,10 @@
           <w:tcPr>
             <w:tcW w:type="dxa" w:w="3000"/>
             <w:tcBorders>
-              <w:top w:val="single" w:color="B8C0AE" w:sz="4"/>
-              <w:left w:val="single" w:color="B8C0AE" w:sz="4"/>
-              <w:bottom w:val="single" w:color="B8C0AE" w:sz="4"/>
-              <w:right w:val="single" w:color="B8C0AE" w:sz="4"/>
+              <w:top w:val="single" w:color="000000" w:sz="4"/>
+              <w:left w:val="single" w:color="000000" w:sz="4"/>
+              <w:bottom w:val="single" w:color="000000" w:sz="4"/>
+              <w:right w:val="single" w:color="000000" w:sz="4"/>
             </w:tcBorders>
             <w:tcMar>
               <w:top w:type="dxa" w:w="70"/>
@@ -2298,7 +2073,7 @@
                 <w:sz w:val="20"/>
                 <w:szCs w:val="20"/>
               </w:rPr>
-              <w:t xml:space="preserve">Contact pour exercer les droits (accès, rectification, suppression, opposition)</w:t>
+              <w:t xml:space="preserve">Demandes d’adhésion refusées</w:t>
             </w:r>
           </w:p>
         </w:tc>
@@ -2306,30 +2081,29 @@
           <w:tcPr>
             <w:tcW w:type="dxa" w:w="5800"/>
             <w:tcBorders>
-              <w:top w:val="single" w:color="B8C0AE" w:sz="4"/>
-              <w:left w:val="single" w:color="B8C0AE" w:sz="4"/>
-              <w:bottom w:val="single" w:color="B8C0AE" w:sz="4"/>
-              <w:right w:val="single" w:color="B8C0AE" w:sz="4"/>
-            </w:tcBorders>
-            <w:shd w:fill="EEF0E8" w:color="auto" w:val="clear"/>
-            <w:tcMar>
-              <w:top w:type="dxa" w:w="70"/>
-              <w:left w:type="dxa" w:w="100"/>
-              <w:bottom w:type="dxa" w:w="70"/>
-              <w:right w:type="dxa" w:w="100"/>
-            </w:tcMar>
-          </w:tcPr>
-          <w:p>
-            <w:pPr>
-              <w:spacing w:after="80"/>
-            </w:pPr>
-            <w:r>
-              <w:rPr>
-                <w:rFonts w:ascii="Arial" w:cs="Arial" w:eastAsia="Arial" w:hAnsi="Arial"/>
-                <w:sz w:val="20"/>
-                <w:szCs w:val="20"/>
-              </w:rPr>
-              <w:t xml:space="preserve">Info@zabantu.net. Proposition : désigner une personne du groupe chargée de ces demandes. Nom :</w:t>
+              <w:top w:val="single" w:color="000000" w:sz="4"/>
+              <w:left w:val="single" w:color="000000" w:sz="4"/>
+              <w:bottom w:val="single" w:color="000000" w:sz="4"/>
+              <w:right w:val="single" w:color="000000" w:sz="4"/>
+            </w:tcBorders>
+            <w:tcMar>
+              <w:top w:type="dxa" w:w="70"/>
+              <w:left w:type="dxa" w:w="100"/>
+              <w:bottom w:type="dxa" w:w="70"/>
+              <w:right w:type="dxa" w:w="100"/>
+            </w:tcMar>
+          </w:tcPr>
+          <w:p>
+            <w:pPr>
+              <w:spacing w:after="80"/>
+            </w:pPr>
+            <w:r>
+              <w:rPr>
+                <w:rFonts w:ascii="Arial" w:cs="Arial" w:eastAsia="Arial" w:hAnsi="Arial"/>
+                <w:sz w:val="20"/>
+                <w:szCs w:val="20"/>
+              </w:rPr>
+              <w:t xml:space="preserve">Proposition : 1 an.</w:t>
             </w:r>
           </w:p>
         </w:tc>
@@ -2337,12 +2111,11 @@
           <w:tcPr>
             <w:tcW w:type="dxa" w:w="5438"/>
             <w:tcBorders>
-              <w:top w:val="single" w:color="B8C0AE" w:sz="4"/>
-              <w:left w:val="single" w:color="B8C0AE" w:sz="4"/>
-              <w:bottom w:val="single" w:color="B8C0AE" w:sz="4"/>
-              <w:right w:val="single" w:color="B8C0AE" w:sz="4"/>
-            </w:tcBorders>
-            <w:shd w:fill="FFF3C4" w:color="auto" w:val="clear"/>
+              <w:top w:val="single" w:color="000000" w:sz="4"/>
+              <w:left w:val="single" w:color="000000" w:sz="4"/>
+              <w:bottom w:val="single" w:color="000000" w:sz="4"/>
+              <w:right w:val="single" w:color="000000" w:sz="4"/>
+            </w:tcBorders>
             <w:tcMar>
               <w:top w:type="dxa" w:w="70"/>
               <w:left w:type="dxa" w:w="100"/>
@@ -2373,10 +2146,10 @@
           <w:tcPr>
             <w:tcW w:type="dxa" w:w="600"/>
             <w:tcBorders>
-              <w:top w:val="single" w:color="B8C0AE" w:sz="4"/>
-              <w:left w:val="single" w:color="B8C0AE" w:sz="4"/>
-              <w:bottom w:val="single" w:color="B8C0AE" w:sz="4"/>
-              <w:right w:val="single" w:color="B8C0AE" w:sz="4"/>
+              <w:top w:val="single" w:color="000000" w:sz="4"/>
+              <w:left w:val="single" w:color="000000" w:sz="4"/>
+              <w:bottom w:val="single" w:color="000000" w:sz="4"/>
+              <w:right w:val="single" w:color="000000" w:sz="4"/>
             </w:tcBorders>
             <w:tcMar>
               <w:top w:type="dxa" w:w="70"/>
@@ -2403,10 +2176,10 @@
           <w:tcPr>
             <w:tcW w:type="dxa" w:w="3000"/>
             <w:tcBorders>
-              <w:top w:val="single" w:color="B8C0AE" w:sz="4"/>
-              <w:left w:val="single" w:color="B8C0AE" w:sz="4"/>
-              <w:bottom w:val="single" w:color="B8C0AE" w:sz="4"/>
-              <w:right w:val="single" w:color="B8C0AE" w:sz="4"/>
+              <w:top w:val="single" w:color="000000" w:sz="4"/>
+              <w:left w:val="single" w:color="000000" w:sz="4"/>
+              <w:bottom w:val="single" w:color="000000" w:sz="4"/>
+              <w:right w:val="single" w:color="000000" w:sz="4"/>
             </w:tcBorders>
             <w:tcMar>
               <w:top w:type="dxa" w:w="70"/>
@@ -2427,7 +2200,7 @@
                 <w:sz w:val="20"/>
                 <w:szCs w:val="20"/>
               </w:rPr>
-              <w:t xml:space="preserve">Délai de réponse aux demandes</w:t>
+              <w:t xml:space="preserve">Membres</w:t>
             </w:r>
           </w:p>
         </w:tc>
@@ -2435,30 +2208,29 @@
           <w:tcPr>
             <w:tcW w:type="dxa" w:w="5800"/>
             <w:tcBorders>
-              <w:top w:val="single" w:color="B8C0AE" w:sz="4"/>
-              <w:left w:val="single" w:color="B8C0AE" w:sz="4"/>
-              <w:bottom w:val="single" w:color="B8C0AE" w:sz="4"/>
-              <w:right w:val="single" w:color="B8C0AE" w:sz="4"/>
-            </w:tcBorders>
-            <w:shd w:fill="EEF0E8" w:color="auto" w:val="clear"/>
-            <w:tcMar>
-              <w:top w:type="dxa" w:w="70"/>
-              <w:left w:type="dxa" w:w="100"/>
-              <w:bottom w:type="dxa" w:w="70"/>
-              <w:right w:type="dxa" w:w="100"/>
-            </w:tcMar>
-          </w:tcPr>
-          <w:p>
-            <w:pPr>
-              <w:spacing w:after="80"/>
-            </w:pPr>
-            <w:r>
-              <w:rPr>
-                <w:rFonts w:ascii="Arial" w:cs="Arial" w:eastAsia="Arial" w:hAnsi="Arial"/>
-                <w:sz w:val="20"/>
-                <w:szCs w:val="20"/>
-              </w:rPr>
-              <w:t xml:space="preserve">Proposition : un mois.</w:t>
+              <w:top w:val="single" w:color="000000" w:sz="4"/>
+              <w:left w:val="single" w:color="000000" w:sz="4"/>
+              <w:bottom w:val="single" w:color="000000" w:sz="4"/>
+              <w:right w:val="single" w:color="000000" w:sz="4"/>
+            </w:tcBorders>
+            <w:tcMar>
+              <w:top w:type="dxa" w:w="70"/>
+              <w:left w:type="dxa" w:w="100"/>
+              <w:bottom w:type="dxa" w:w="70"/>
+              <w:right w:type="dxa" w:w="100"/>
+            </w:tcMar>
+          </w:tcPr>
+          <w:p>
+            <w:pPr>
+              <w:spacing w:after="80"/>
+            </w:pPr>
+            <w:r>
+              <w:rPr>
+                <w:rFonts w:ascii="Arial" w:cs="Arial" w:eastAsia="Arial" w:hAnsi="Arial"/>
+                <w:sz w:val="20"/>
+                <w:szCs w:val="20"/>
+              </w:rPr>
+              <w:t xml:space="preserve">Proposition : pendant l’adhésion, puis 3 ans après la fin de l’adhésion.</w:t>
             </w:r>
           </w:p>
         </w:tc>
@@ -2466,12 +2238,11 @@
           <w:tcPr>
             <w:tcW w:type="dxa" w:w="5438"/>
             <w:tcBorders>
-              <w:top w:val="single" w:color="B8C0AE" w:sz="4"/>
-              <w:left w:val="single" w:color="B8C0AE" w:sz="4"/>
-              <w:bottom w:val="single" w:color="B8C0AE" w:sz="4"/>
-              <w:right w:val="single" w:color="B8C0AE" w:sz="4"/>
-            </w:tcBorders>
-            <w:shd w:fill="FFF3C4" w:color="auto" w:val="clear"/>
+              <w:top w:val="single" w:color="000000" w:sz="4"/>
+              <w:left w:val="single" w:color="000000" w:sz="4"/>
+              <w:bottom w:val="single" w:color="000000" w:sz="4"/>
+              <w:right w:val="single" w:color="000000" w:sz="4"/>
+            </w:tcBorders>
             <w:tcMar>
               <w:top w:type="dxa" w:w="70"/>
               <w:left w:type="dxa" w:w="100"/>
@@ -2502,10 +2273,10 @@
           <w:tcPr>
             <w:tcW w:type="dxa" w:w="600"/>
             <w:tcBorders>
-              <w:top w:val="single" w:color="B8C0AE" w:sz="4"/>
-              <w:left w:val="single" w:color="B8C0AE" w:sz="4"/>
-              <w:bottom w:val="single" w:color="B8C0AE" w:sz="4"/>
-              <w:right w:val="single" w:color="B8C0AE" w:sz="4"/>
+              <w:top w:val="single" w:color="000000" w:sz="4"/>
+              <w:left w:val="single" w:color="000000" w:sz="4"/>
+              <w:bottom w:val="single" w:color="000000" w:sz="4"/>
+              <w:right w:val="single" w:color="000000" w:sz="4"/>
             </w:tcBorders>
             <w:tcMar>
               <w:top w:type="dxa" w:w="70"/>
@@ -2532,10 +2303,10 @@
           <w:tcPr>
             <w:tcW w:type="dxa" w:w="3000"/>
             <w:tcBorders>
-              <w:top w:val="single" w:color="B8C0AE" w:sz="4"/>
-              <w:left w:val="single" w:color="B8C0AE" w:sz="4"/>
-              <w:bottom w:val="single" w:color="B8C0AE" w:sz="4"/>
-              <w:right w:val="single" w:color="B8C0AE" w:sz="4"/>
+              <w:top w:val="single" w:color="000000" w:sz="4"/>
+              <w:left w:val="single" w:color="000000" w:sz="4"/>
+              <w:bottom w:val="single" w:color="000000" w:sz="4"/>
+              <w:right w:val="single" w:color="000000" w:sz="4"/>
             </w:tcBorders>
             <w:tcMar>
               <w:top w:type="dxa" w:w="70"/>
@@ -2556,7 +2327,7 @@
                 <w:sz w:val="20"/>
                 <w:szCs w:val="20"/>
               </w:rPr>
-              <w:t xml:space="preserve">Personnes qui accèdent aux données</w:t>
+              <w:t xml:space="preserve">Abonnés à l’info-lettre</w:t>
             </w:r>
           </w:p>
         </w:tc>
@@ -2564,30 +2335,29 @@
           <w:tcPr>
             <w:tcW w:type="dxa" w:w="5800"/>
             <w:tcBorders>
-              <w:top w:val="single" w:color="B8C0AE" w:sz="4"/>
-              <w:left w:val="single" w:color="B8C0AE" w:sz="4"/>
-              <w:bottom w:val="single" w:color="B8C0AE" w:sz="4"/>
-              <w:right w:val="single" w:color="B8C0AE" w:sz="4"/>
-            </w:tcBorders>
-            <w:shd w:fill="EEF0E8" w:color="auto" w:val="clear"/>
-            <w:tcMar>
-              <w:top w:type="dxa" w:w="70"/>
-              <w:left w:type="dxa" w:w="100"/>
-              <w:bottom w:type="dxa" w:w="70"/>
-              <w:right w:type="dxa" w:w="100"/>
-            </w:tcMar>
-          </w:tcPr>
-          <w:p>
-            <w:pPr>
-              <w:spacing w:after="80"/>
-            </w:pPr>
-            <w:r>
-              <w:rPr>
-                <w:rFonts w:ascii="Arial" w:cs="Arial" w:eastAsia="Arial" w:hAnsi="Arial"/>
-                <w:sz w:val="20"/>
-                <w:szCs w:val="20"/>
-              </w:rPr>
-              <w:t xml:space="preserve">Administrateurs et modérateurs du site (traitement des messages, des candidatures et des envois), et l’hébergeur LWS. Y a-t-il d’autres personnes ou services ?</w:t>
+              <w:top w:val="single" w:color="000000" w:sz="4"/>
+              <w:left w:val="single" w:color="000000" w:sz="4"/>
+              <w:bottom w:val="single" w:color="000000" w:sz="4"/>
+              <w:right w:val="single" w:color="000000" w:sz="4"/>
+            </w:tcBorders>
+            <w:tcMar>
+              <w:top w:type="dxa" w:w="70"/>
+              <w:left w:type="dxa" w:w="100"/>
+              <w:bottom w:type="dxa" w:w="70"/>
+              <w:right w:type="dxa" w:w="100"/>
+            </w:tcMar>
+          </w:tcPr>
+          <w:p>
+            <w:pPr>
+              <w:spacing w:after="80"/>
+            </w:pPr>
+            <w:r>
+              <w:rPr>
+                <w:rFonts w:ascii="Arial" w:cs="Arial" w:eastAsia="Arial" w:hAnsi="Arial"/>
+                <w:sz w:val="20"/>
+                <w:szCs w:val="20"/>
+              </w:rPr>
+              <w:t xml:space="preserve">Proposition : jusqu’au désabonnement, puis 1 an.</w:t>
             </w:r>
           </w:p>
         </w:tc>
@@ -2595,12 +2365,138 @@
           <w:tcPr>
             <w:tcW w:type="dxa" w:w="5438"/>
             <w:tcBorders>
-              <w:top w:val="single" w:color="B8C0AE" w:sz="4"/>
-              <w:left w:val="single" w:color="B8C0AE" w:sz="4"/>
-              <w:bottom w:val="single" w:color="B8C0AE" w:sz="4"/>
-              <w:right w:val="single" w:color="B8C0AE" w:sz="4"/>
-            </w:tcBorders>
-            <w:shd w:fill="FFF3C4" w:color="auto" w:val="clear"/>
+              <w:top w:val="single" w:color="000000" w:sz="4"/>
+              <w:left w:val="single" w:color="000000" w:sz="4"/>
+              <w:bottom w:val="single" w:color="000000" w:sz="4"/>
+              <w:right w:val="single" w:color="000000" w:sz="4"/>
+            </w:tcBorders>
+            <w:tcMar>
+              <w:top w:type="dxa" w:w="70"/>
+              <w:left w:type="dxa" w:w="100"/>
+              <w:bottom w:type="dxa" w:w="70"/>
+              <w:right w:type="dxa" w:w="100"/>
+            </w:tcMar>
+          </w:tcPr>
+          <w:p>
+            <w:pPr>
+              <w:spacing w:after="80"/>
+            </w:pPr>
+            <w:r>
+              <w:rPr>
+                <w:rFonts w:ascii="Arial" w:cs="Arial" w:eastAsia="Arial" w:hAnsi="Arial"/>
+                <w:sz w:val="20"/>
+                <w:szCs w:val="20"/>
+              </w:rPr>
+              <w:t xml:space="preserve"/>
+            </w:r>
+          </w:p>
+        </w:tc>
+      </w:tr>
+      <w:tr>
+        <w:trPr>
+          <w:cantSplit/>
+        </w:trPr>
+        <w:tc>
+          <w:tcPr>
+            <w:tcW w:type="dxa" w:w="600"/>
+            <w:tcBorders>
+              <w:top w:val="single" w:color="000000" w:sz="4"/>
+              <w:left w:val="single" w:color="000000" w:sz="4"/>
+              <w:bottom w:val="single" w:color="000000" w:sz="4"/>
+              <w:right w:val="single" w:color="000000" w:sz="4"/>
+            </w:tcBorders>
+            <w:tcMar>
+              <w:top w:type="dxa" w:w="70"/>
+              <w:left w:type="dxa" w:w="100"/>
+              <w:bottom w:type="dxa" w:w="70"/>
+              <w:right w:type="dxa" w:w="100"/>
+            </w:tcMar>
+          </w:tcPr>
+          <w:p>
+            <w:pPr>
+              <w:spacing w:after="80"/>
+            </w:pPr>
+            <w:r>
+              <w:rPr>
+                <w:rFonts w:ascii="Arial" w:cs="Arial" w:eastAsia="Arial" w:hAnsi="Arial"/>
+                <w:sz w:val="20"/>
+                <w:szCs w:val="20"/>
+              </w:rPr>
+              <w:t xml:space="preserve">4.5</w:t>
+            </w:r>
+          </w:p>
+        </w:tc>
+        <w:tc>
+          <w:tcPr>
+            <w:tcW w:type="dxa" w:w="3000"/>
+            <w:tcBorders>
+              <w:top w:val="single" w:color="000000" w:sz="4"/>
+              <w:left w:val="single" w:color="000000" w:sz="4"/>
+              <w:bottom w:val="single" w:color="000000" w:sz="4"/>
+              <w:right w:val="single" w:color="000000" w:sz="4"/>
+            </w:tcBorders>
+            <w:tcMar>
+              <w:top w:type="dxa" w:w="70"/>
+              <w:left w:type="dxa" w:w="100"/>
+              <w:bottom w:type="dxa" w:w="70"/>
+              <w:right w:type="dxa" w:w="100"/>
+            </w:tcMar>
+          </w:tcPr>
+          <w:p>
+            <w:pPr>
+              <w:spacing w:after="80"/>
+            </w:pPr>
+            <w:r>
+              <w:rPr>
+                <w:rFonts w:ascii="Arial" w:cs="Arial" w:eastAsia="Arial" w:hAnsi="Arial"/>
+                <w:b/>
+                <w:bCs/>
+                <w:sz w:val="20"/>
+                <w:szCs w:val="20"/>
+              </w:rPr>
+              <w:t xml:space="preserve">Journaux techniques du serveur (adresse IP, pages visitées)</w:t>
+            </w:r>
+          </w:p>
+        </w:tc>
+        <w:tc>
+          <w:tcPr>
+            <w:tcW w:type="dxa" w:w="5800"/>
+            <w:tcBorders>
+              <w:top w:val="single" w:color="000000" w:sz="4"/>
+              <w:left w:val="single" w:color="000000" w:sz="4"/>
+              <w:bottom w:val="single" w:color="000000" w:sz="4"/>
+              <w:right w:val="single" w:color="000000" w:sz="4"/>
+            </w:tcBorders>
+            <w:tcMar>
+              <w:top w:type="dxa" w:w="70"/>
+              <w:left w:type="dxa" w:w="100"/>
+              <w:bottom w:type="dxa" w:w="70"/>
+              <w:right w:type="dxa" w:w="100"/>
+            </w:tcMar>
+          </w:tcPr>
+          <w:p>
+            <w:pPr>
+              <w:spacing w:after="80"/>
+            </w:pPr>
+            <w:r>
+              <w:rPr>
+                <w:rFonts w:ascii="Arial" w:cs="Arial" w:eastAsia="Arial" w:hAnsi="Arial"/>
+                <w:sz w:val="20"/>
+                <w:szCs w:val="20"/>
+              </w:rPr>
+              <w:t xml:space="preserve">Proposition : 12 mois au plus.</w:t>
+            </w:r>
+          </w:p>
+        </w:tc>
+        <w:tc>
+          <w:tcPr>
+            <w:tcW w:type="dxa" w:w="5438"/>
+            <w:tcBorders>
+              <w:top w:val="single" w:color="000000" w:sz="4"/>
+              <w:left w:val="single" w:color="000000" w:sz="4"/>
+              <w:bottom w:val="single" w:color="000000" w:sz="4"/>
+              <w:right w:val="single" w:color="000000" w:sz="4"/>
+            </w:tcBorders>
             <w:tcMar>
               <w:top w:type="dxa" w:w="70"/>
               <w:left w:type="dxa" w:w="100"/>
@@ -2635,11 +2531,10 @@
           <w:rFonts w:ascii="Arial" w:cs="Arial" w:eastAsia="Arial" w:hAnsi="Arial"/>
           <w:b/>
           <w:bCs/>
-          <w:color w:val="2F4A2C"/>
           <w:sz w:val="26"/>
           <w:szCs w:val="26"/>
         </w:rPr>
-        <w:t xml:space="preserve">5. Durées de conservation des données</w:t>
+        <w:t xml:space="preserve">5. Utilisation des contenus du site</w:t>
       </w:r>
     </w:p>
     <w:tbl>
@@ -2668,12 +2563,11 @@
           <w:tcPr>
             <w:tcW w:type="dxa" w:w="600"/>
             <w:tcBorders>
-              <w:top w:val="single" w:color="B8C0AE" w:sz="4"/>
-              <w:left w:val="single" w:color="B8C0AE" w:sz="4"/>
-              <w:bottom w:val="single" w:color="B8C0AE" w:sz="4"/>
-              <w:right w:val="single" w:color="B8C0AE" w:sz="4"/>
-            </w:tcBorders>
-            <w:shd w:fill="2F4A2C" w:color="auto" w:val="clear"/>
+              <w:top w:val="single" w:color="000000" w:sz="4"/>
+              <w:left w:val="single" w:color="000000" w:sz="4"/>
+              <w:bottom w:val="single" w:color="000000" w:sz="4"/>
+              <w:right w:val="single" w:color="000000" w:sz="4"/>
+            </w:tcBorders>
             <w:tcMar>
               <w:top w:type="dxa" w:w="70"/>
               <w:left w:type="dxa" w:w="100"/>
@@ -2690,7 +2584,6 @@
                 <w:rFonts w:ascii="Arial" w:cs="Arial" w:eastAsia="Arial" w:hAnsi="Arial"/>
                 <w:b/>
                 <w:bCs/>
-                <w:color w:val="FFFFFF"/>
                 <w:sz w:val="20"/>
                 <w:szCs w:val="20"/>
               </w:rPr>
@@ -2702,12 +2595,11 @@
           <w:tcPr>
             <w:tcW w:type="dxa" w:w="3000"/>
             <w:tcBorders>
-              <w:top w:val="single" w:color="B8C0AE" w:sz="4"/>
-              <w:left w:val="single" w:color="B8C0AE" w:sz="4"/>
-              <w:bottom w:val="single" w:color="B8C0AE" w:sz="4"/>
-              <w:right w:val="single" w:color="B8C0AE" w:sz="4"/>
-            </w:tcBorders>
-            <w:shd w:fill="2F4A2C" w:color="auto" w:val="clear"/>
+              <w:top w:val="single" w:color="000000" w:sz="4"/>
+              <w:left w:val="single" w:color="000000" w:sz="4"/>
+              <w:bottom w:val="single" w:color="000000" w:sz="4"/>
+              <w:right w:val="single" w:color="000000" w:sz="4"/>
+            </w:tcBorders>
             <w:tcMar>
               <w:top w:type="dxa" w:w="70"/>
               <w:left w:type="dxa" w:w="100"/>
@@ -2724,11 +2616,10 @@
                 <w:rFonts w:ascii="Arial" w:cs="Arial" w:eastAsia="Arial" w:hAnsi="Arial"/>
                 <w:b/>
                 <w:bCs/>
-                <w:color w:val="FFFFFF"/>
-                <w:sz w:val="20"/>
-                <w:szCs w:val="20"/>
-              </w:rPr>
-              <w:t xml:space="preserve">Information demandée</w:t>
+                <w:sz w:val="20"/>
+                <w:szCs w:val="20"/>
+              </w:rPr>
+              <w:t xml:space="preserve">Information</w:t>
             </w:r>
           </w:p>
         </w:tc>
@@ -2736,12 +2627,11 @@
           <w:tcPr>
             <w:tcW w:type="dxa" w:w="5800"/>
             <w:tcBorders>
-              <w:top w:val="single" w:color="B8C0AE" w:sz="4"/>
-              <w:left w:val="single" w:color="B8C0AE" w:sz="4"/>
-              <w:bottom w:val="single" w:color="B8C0AE" w:sz="4"/>
-              <w:right w:val="single" w:color="B8C0AE" w:sz="4"/>
-            </w:tcBorders>
-            <w:shd w:fill="2F4A2C" w:color="auto" w:val="clear"/>
+              <w:top w:val="single" w:color="000000" w:sz="4"/>
+              <w:left w:val="single" w:color="000000" w:sz="4"/>
+              <w:bottom w:val="single" w:color="000000" w:sz="4"/>
+              <w:right w:val="single" w:color="000000" w:sz="4"/>
+            </w:tcBorders>
             <w:tcMar>
               <w:top w:type="dxa" w:w="70"/>
               <w:left w:type="dxa" w:w="100"/>
@@ -2758,11 +2648,10 @@
                 <w:rFonts w:ascii="Arial" w:cs="Arial" w:eastAsia="Arial" w:hAnsi="Arial"/>
                 <w:b/>
                 <w:bCs/>
-                <w:color w:val="FFFFFF"/>
-                <w:sz w:val="20"/>
-                <w:szCs w:val="20"/>
-              </w:rPr>
-              <w:t xml:space="preserve">Ce que nous savons / notre proposition</w:t>
+                <w:sz w:val="20"/>
+                <w:szCs w:val="20"/>
+              </w:rPr>
+              <w:t xml:space="preserve">Ce que nous avons (ou proposons)</w:t>
             </w:r>
           </w:p>
         </w:tc>
@@ -2770,12 +2659,11 @@
           <w:tcPr>
             <w:tcW w:type="dxa" w:w="5438"/>
             <w:tcBorders>
-              <w:top w:val="single" w:color="B8C0AE" w:sz="4"/>
-              <w:left w:val="single" w:color="B8C0AE" w:sz="4"/>
-              <w:bottom w:val="single" w:color="B8C0AE" w:sz="4"/>
-              <w:right w:val="single" w:color="B8C0AE" w:sz="4"/>
-            </w:tcBorders>
-            <w:shd w:fill="2F4A2C" w:color="auto" w:val="clear"/>
+              <w:top w:val="single" w:color="000000" w:sz="4"/>
+              <w:left w:val="single" w:color="000000" w:sz="4"/>
+              <w:bottom w:val="single" w:color="000000" w:sz="4"/>
+              <w:right w:val="single" w:color="000000" w:sz="4"/>
+            </w:tcBorders>
             <w:tcMar>
               <w:top w:type="dxa" w:w="70"/>
               <w:left w:type="dxa" w:w="100"/>
@@ -2792,11 +2680,10 @@
                 <w:rFonts w:ascii="Arial" w:cs="Arial" w:eastAsia="Arial" w:hAnsi="Arial"/>
                 <w:b/>
                 <w:bCs/>
-                <w:color w:val="FFFFFF"/>
-                <w:sz w:val="20"/>
-                <w:szCs w:val="20"/>
-              </w:rPr>
-              <w:t xml:space="preserve">Correction du groupe (à remplir si différent)</w:t>
+                <w:sz w:val="20"/>
+                <w:szCs w:val="20"/>
+              </w:rPr>
+              <w:t xml:space="preserve">Correction du groupe (seulement si différent)</w:t>
             </w:r>
           </w:p>
         </w:tc>
@@ -2809,10 +2696,10 @@
           <w:tcPr>
             <w:tcW w:type="dxa" w:w="600"/>
             <w:tcBorders>
-              <w:top w:val="single" w:color="B8C0AE" w:sz="4"/>
-              <w:left w:val="single" w:color="B8C0AE" w:sz="4"/>
-              <w:bottom w:val="single" w:color="B8C0AE" w:sz="4"/>
-              <w:right w:val="single" w:color="B8C0AE" w:sz="4"/>
+              <w:top w:val="single" w:color="000000" w:sz="4"/>
+              <w:left w:val="single" w:color="000000" w:sz="4"/>
+              <w:bottom w:val="single" w:color="000000" w:sz="4"/>
+              <w:right w:val="single" w:color="000000" w:sz="4"/>
             </w:tcBorders>
             <w:tcMar>
               <w:top w:type="dxa" w:w="70"/>
@@ -2839,10 +2726,10 @@
           <w:tcPr>
             <w:tcW w:type="dxa" w:w="3000"/>
             <w:tcBorders>
-              <w:top w:val="single" w:color="B8C0AE" w:sz="4"/>
-              <w:left w:val="single" w:color="B8C0AE" w:sz="4"/>
-              <w:bottom w:val="single" w:color="B8C0AE" w:sz="4"/>
-              <w:right w:val="single" w:color="B8C0AE" w:sz="4"/>
+              <w:top w:val="single" w:color="000000" w:sz="4"/>
+              <w:left w:val="single" w:color="000000" w:sz="4"/>
+              <w:bottom w:val="single" w:color="000000" w:sz="4"/>
+              <w:right w:val="single" w:color="000000" w:sz="4"/>
             </w:tcBorders>
             <w:tcMar>
               <w:top w:type="dxa" w:w="70"/>
@@ -2863,7 +2750,7 @@
                 <w:sz w:val="20"/>
                 <w:szCs w:val="20"/>
               </w:rPr>
-              <w:t xml:space="preserve">Messages du formulaire de contact</w:t>
+              <w:t xml:space="preserve">Reprise de nos textes et photos par d’autres personnes</w:t>
             </w:r>
           </w:p>
         </w:tc>
@@ -2871,30 +2758,29 @@
           <w:tcPr>
             <w:tcW w:type="dxa" w:w="5800"/>
             <w:tcBorders>
-              <w:top w:val="single" w:color="B8C0AE" w:sz="4"/>
-              <w:left w:val="single" w:color="B8C0AE" w:sz="4"/>
-              <w:bottom w:val="single" w:color="B8C0AE" w:sz="4"/>
-              <w:right w:val="single" w:color="B8C0AE" w:sz="4"/>
-            </w:tcBorders>
-            <w:shd w:fill="EEF0E8" w:color="auto" w:val="clear"/>
-            <w:tcMar>
-              <w:top w:type="dxa" w:w="70"/>
-              <w:left w:type="dxa" w:w="100"/>
-              <w:bottom w:type="dxa" w:w="70"/>
-              <w:right w:type="dxa" w:w="100"/>
-            </w:tcMar>
-          </w:tcPr>
-          <w:p>
-            <w:pPr>
-              <w:spacing w:after="80"/>
-            </w:pPr>
-            <w:r>
-              <w:rPr>
-                <w:rFonts w:ascii="Arial" w:cs="Arial" w:eastAsia="Arial" w:hAnsi="Arial"/>
-                <w:sz w:val="20"/>
-                <w:szCs w:val="20"/>
-              </w:rPr>
-              <w:t xml:space="preserve">Proposition : 3 ans après le dernier échange.</w:t>
+              <w:top w:val="single" w:color="000000" w:sz="4"/>
+              <w:left w:val="single" w:color="000000" w:sz="4"/>
+              <w:bottom w:val="single" w:color="000000" w:sz="4"/>
+              <w:right w:val="single" w:color="000000" w:sz="4"/>
+            </w:tcBorders>
+            <w:tcMar>
+              <w:top w:type="dxa" w:w="70"/>
+              <w:left w:type="dxa" w:w="100"/>
+              <w:bottom w:type="dxa" w:w="70"/>
+              <w:right w:type="dxa" w:w="100"/>
+            </w:tcMar>
+          </w:tcPr>
+          <w:p>
+            <w:pPr>
+              <w:spacing w:after="80"/>
+            </w:pPr>
+            <w:r>
+              <w:rPr>
+                <w:rFonts w:ascii="Arial" w:cs="Arial" w:eastAsia="Arial" w:hAnsi="Arial"/>
+                <w:sz w:val="20"/>
+                <w:szCs w:val="20"/>
+              </w:rPr>
+              <w:t xml:space="preserve">Les textes, publications et photos appartiennent au groupe ou à leurs auteurs. Proposition : toute personne qui veut les reprendre doit d’abord demander l’autorisation au groupe, sauf pour une courte citation avec le nom de l’auteur et la source. Cette règle vous convient-elle ?</w:t>
             </w:r>
           </w:p>
         </w:tc>
@@ -2902,12 +2788,11 @@
           <w:tcPr>
             <w:tcW w:type="dxa" w:w="5438"/>
             <w:tcBorders>
-              <w:top w:val="single" w:color="B8C0AE" w:sz="4"/>
-              <w:left w:val="single" w:color="B8C0AE" w:sz="4"/>
-              <w:bottom w:val="single" w:color="B8C0AE" w:sz="4"/>
-              <w:right w:val="single" w:color="B8C0AE" w:sz="4"/>
-            </w:tcBorders>
-            <w:shd w:fill="FFF3C4" w:color="auto" w:val="clear"/>
+              <w:top w:val="single" w:color="000000" w:sz="4"/>
+              <w:left w:val="single" w:color="000000" w:sz="4"/>
+              <w:bottom w:val="single" w:color="000000" w:sz="4"/>
+              <w:right w:val="single" w:color="000000" w:sz="4"/>
+            </w:tcBorders>
             <w:tcMar>
               <w:top w:type="dxa" w:w="70"/>
               <w:left w:type="dxa" w:w="100"/>
@@ -2938,10 +2823,10 @@
           <w:tcPr>
             <w:tcW w:type="dxa" w:w="600"/>
             <w:tcBorders>
-              <w:top w:val="single" w:color="B8C0AE" w:sz="4"/>
-              <w:left w:val="single" w:color="B8C0AE" w:sz="4"/>
-              <w:bottom w:val="single" w:color="B8C0AE" w:sz="4"/>
-              <w:right w:val="single" w:color="B8C0AE" w:sz="4"/>
+              <w:top w:val="single" w:color="000000" w:sz="4"/>
+              <w:left w:val="single" w:color="000000" w:sz="4"/>
+              <w:bottom w:val="single" w:color="000000" w:sz="4"/>
+              <w:right w:val="single" w:color="000000" w:sz="4"/>
             </w:tcBorders>
             <w:tcMar>
               <w:top w:type="dxa" w:w="70"/>
@@ -2968,10 +2853,10 @@
           <w:tcPr>
             <w:tcW w:type="dxa" w:w="3000"/>
             <w:tcBorders>
-              <w:top w:val="single" w:color="B8C0AE" w:sz="4"/>
-              <w:left w:val="single" w:color="B8C0AE" w:sz="4"/>
-              <w:bottom w:val="single" w:color="B8C0AE" w:sz="4"/>
-              <w:right w:val="single" w:color="B8C0AE" w:sz="4"/>
+              <w:top w:val="single" w:color="000000" w:sz="4"/>
+              <w:left w:val="single" w:color="000000" w:sz="4"/>
+              <w:bottom w:val="single" w:color="000000" w:sz="4"/>
+              <w:right w:val="single" w:color="000000" w:sz="4"/>
             </w:tcBorders>
             <w:tcMar>
               <w:top w:type="dxa" w:w="70"/>
@@ -2992,7 +2877,7 @@
                 <w:sz w:val="20"/>
                 <w:szCs w:val="20"/>
               </w:rPr>
-              <w:t xml:space="preserve">Demandes d’adhésion refusées</w:t>
+              <w:t xml:space="preserve">Tribunal en cas de litige</w:t>
             </w:r>
           </w:p>
         </w:tc>
@@ -3000,30 +2885,29 @@
           <w:tcPr>
             <w:tcW w:type="dxa" w:w="5800"/>
             <w:tcBorders>
-              <w:top w:val="single" w:color="B8C0AE" w:sz="4"/>
-              <w:left w:val="single" w:color="B8C0AE" w:sz="4"/>
-              <w:bottom w:val="single" w:color="B8C0AE" w:sz="4"/>
-              <w:right w:val="single" w:color="B8C0AE" w:sz="4"/>
-            </w:tcBorders>
-            <w:shd w:fill="EEF0E8" w:color="auto" w:val="clear"/>
-            <w:tcMar>
-              <w:top w:type="dxa" w:w="70"/>
-              <w:left w:type="dxa" w:w="100"/>
-              <w:bottom w:type="dxa" w:w="70"/>
-              <w:right w:type="dxa" w:w="100"/>
-            </w:tcMar>
-          </w:tcPr>
-          <w:p>
-            <w:pPr>
-              <w:spacing w:after="80"/>
-            </w:pPr>
-            <w:r>
-              <w:rPr>
-                <w:rFonts w:ascii="Arial" w:cs="Arial" w:eastAsia="Arial" w:hAnsi="Arial"/>
-                <w:sz w:val="20"/>
-                <w:szCs w:val="20"/>
-              </w:rPr>
-              <w:t xml:space="preserve">Proposition : 1 an.</w:t>
+              <w:top w:val="single" w:color="000000" w:sz="4"/>
+              <w:left w:val="single" w:color="000000" w:sz="4"/>
+              <w:bottom w:val="single" w:color="000000" w:sz="4"/>
+              <w:right w:val="single" w:color="000000" w:sz="4"/>
+            </w:tcBorders>
+            <w:tcMar>
+              <w:top w:type="dxa" w:w="70"/>
+              <w:left w:type="dxa" w:w="100"/>
+              <w:bottom w:type="dxa" w:w="70"/>
+              <w:right w:type="dxa" w:w="100"/>
+            </w:tcMar>
+          </w:tcPr>
+          <w:p>
+            <w:pPr>
+              <w:spacing w:after="80"/>
+            </w:pPr>
+            <w:r>
+              <w:rPr>
+                <w:rFonts w:ascii="Arial" w:cs="Arial" w:eastAsia="Arial" w:hAnsi="Arial"/>
+                <w:sz w:val="20"/>
+                <w:szCs w:val="20"/>
+              </w:rPr>
+              <w:t xml:space="preserve">Proposition : en cas de litige, ce sont les tribunaux de Bamako qui sont compétents, selon le droit malien.</w:t>
             </w:r>
           </w:p>
         </w:tc>
@@ -3031,12 +2915,11 @@
           <w:tcPr>
             <w:tcW w:type="dxa" w:w="5438"/>
             <w:tcBorders>
-              <w:top w:val="single" w:color="B8C0AE" w:sz="4"/>
-              <w:left w:val="single" w:color="B8C0AE" w:sz="4"/>
-              <w:bottom w:val="single" w:color="B8C0AE" w:sz="4"/>
-              <w:right w:val="single" w:color="B8C0AE" w:sz="4"/>
-            </w:tcBorders>
-            <w:shd w:fill="FFF3C4" w:color="auto" w:val="clear"/>
+              <w:top w:val="single" w:color="000000" w:sz="4"/>
+              <w:left w:val="single" w:color="000000" w:sz="4"/>
+              <w:bottom w:val="single" w:color="000000" w:sz="4"/>
+              <w:right w:val="single" w:color="000000" w:sz="4"/>
+            </w:tcBorders>
             <w:tcMar>
               <w:top w:type="dxa" w:w="70"/>
               <w:left w:type="dxa" w:w="100"/>
@@ -3067,10 +2950,10 @@
           <w:tcPr>
             <w:tcW w:type="dxa" w:w="600"/>
             <w:tcBorders>
-              <w:top w:val="single" w:color="B8C0AE" w:sz="4"/>
-              <w:left w:val="single" w:color="B8C0AE" w:sz="4"/>
-              <w:bottom w:val="single" w:color="B8C0AE" w:sz="4"/>
-              <w:right w:val="single" w:color="B8C0AE" w:sz="4"/>
+              <w:top w:val="single" w:color="000000" w:sz="4"/>
+              <w:left w:val="single" w:color="000000" w:sz="4"/>
+              <w:bottom w:val="single" w:color="000000" w:sz="4"/>
+              <w:right w:val="single" w:color="000000" w:sz="4"/>
             </w:tcBorders>
             <w:tcMar>
               <w:top w:type="dxa" w:w="70"/>
@@ -3097,10 +2980,10 @@
           <w:tcPr>
             <w:tcW w:type="dxa" w:w="3000"/>
             <w:tcBorders>
-              <w:top w:val="single" w:color="B8C0AE" w:sz="4"/>
-              <w:left w:val="single" w:color="B8C0AE" w:sz="4"/>
-              <w:bottom w:val="single" w:color="B8C0AE" w:sz="4"/>
-              <w:right w:val="single" w:color="B8C0AE" w:sz="4"/>
+              <w:top w:val="single" w:color="000000" w:sz="4"/>
+              <w:left w:val="single" w:color="000000" w:sz="4"/>
+              <w:bottom w:val="single" w:color="000000" w:sz="4"/>
+              <w:right w:val="single" w:color="000000" w:sz="4"/>
             </w:tcBorders>
             <w:tcMar>
               <w:top w:type="dxa" w:w="70"/>
@@ -3121,7 +3004,7 @@
                 <w:sz w:val="20"/>
                 <w:szCs w:val="20"/>
               </w:rPr>
-              <w:t xml:space="preserve">Membres</w:t>
+              <w:t xml:space="preserve">Signature des publications</w:t>
             </w:r>
           </w:p>
         </w:tc>
@@ -3129,30 +3012,29 @@
           <w:tcPr>
             <w:tcW w:type="dxa" w:w="5800"/>
             <w:tcBorders>
-              <w:top w:val="single" w:color="B8C0AE" w:sz="4"/>
-              <w:left w:val="single" w:color="B8C0AE" w:sz="4"/>
-              <w:bottom w:val="single" w:color="B8C0AE" w:sz="4"/>
-              <w:right w:val="single" w:color="B8C0AE" w:sz="4"/>
-            </w:tcBorders>
-            <w:shd w:fill="EEF0E8" w:color="auto" w:val="clear"/>
-            <w:tcMar>
-              <w:top w:type="dxa" w:w="70"/>
-              <w:left w:type="dxa" w:w="100"/>
-              <w:bottom w:type="dxa" w:w="70"/>
-              <w:right w:type="dxa" w:w="100"/>
-            </w:tcMar>
-          </w:tcPr>
-          <w:p>
-            <w:pPr>
-              <w:spacing w:after="80"/>
-            </w:pPr>
-            <w:r>
-              <w:rPr>
-                <w:rFonts w:ascii="Arial" w:cs="Arial" w:eastAsia="Arial" w:hAnsi="Arial"/>
-                <w:sz w:val="20"/>
-                <w:szCs w:val="20"/>
-              </w:rPr>
-              <w:t xml:space="preserve">Proposition : pendant l’adhésion, puis 3 ans après la fin de l’adhésion.</w:t>
+              <w:top w:val="single" w:color="000000" w:sz="4"/>
+              <w:left w:val="single" w:color="000000" w:sz="4"/>
+              <w:bottom w:val="single" w:color="000000" w:sz="4"/>
+              <w:right w:val="single" w:color="000000" w:sz="4"/>
+            </w:tcBorders>
+            <w:tcMar>
+              <w:top w:type="dxa" w:w="70"/>
+              <w:left w:type="dxa" w:w="100"/>
+              <w:bottom w:type="dxa" w:w="70"/>
+              <w:right w:type="dxa" w:w="100"/>
+            </w:tcMar>
+          </w:tcPr>
+          <w:p>
+            <w:pPr>
+              <w:spacing w:after="80"/>
+            </w:pPr>
+            <w:r>
+              <w:rPr>
+                <w:rFonts w:ascii="Arial" w:cs="Arial" w:eastAsia="Arial" w:hAnsi="Arial"/>
+                <w:sz w:val="20"/>
+                <w:szCs w:val="20"/>
+              </w:rPr>
+              <w:t xml:space="preserve">Sur le site, les articles portent le nom de leurs auteurs, et les photos sont publiées au nom du groupe Zabantu. Est-ce bien ce que vous souhaitez ?</w:t>
             </w:r>
           </w:p>
         </w:tc>
@@ -3160,270 +3042,11 @@
           <w:tcPr>
             <w:tcW w:type="dxa" w:w="5438"/>
             <w:tcBorders>
-              <w:top w:val="single" w:color="B8C0AE" w:sz="4"/>
-              <w:left w:val="single" w:color="B8C0AE" w:sz="4"/>
-              <w:bottom w:val="single" w:color="B8C0AE" w:sz="4"/>
-              <w:right w:val="single" w:color="B8C0AE" w:sz="4"/>
-            </w:tcBorders>
-            <w:shd w:fill="FFF3C4" w:color="auto" w:val="clear"/>
-            <w:tcMar>
-              <w:top w:type="dxa" w:w="70"/>
-              <w:left w:type="dxa" w:w="100"/>
-              <w:bottom w:type="dxa" w:w="70"/>
-              <w:right w:type="dxa" w:w="100"/>
-            </w:tcMar>
-          </w:tcPr>
-          <w:p>
-            <w:pPr>
-              <w:spacing w:after="80"/>
-            </w:pPr>
-            <w:r>
-              <w:rPr>
-                <w:rFonts w:ascii="Arial" w:cs="Arial" w:eastAsia="Arial" w:hAnsi="Arial"/>
-                <w:sz w:val="20"/>
-                <w:szCs w:val="20"/>
-              </w:rPr>
-              <w:t xml:space="preserve"/>
-            </w:r>
-          </w:p>
-        </w:tc>
-      </w:tr>
-      <w:tr>
-        <w:trPr>
-          <w:cantSplit/>
-        </w:trPr>
-        <w:tc>
-          <w:tcPr>
-            <w:tcW w:type="dxa" w:w="600"/>
-            <w:tcBorders>
-              <w:top w:val="single" w:color="B8C0AE" w:sz="4"/>
-              <w:left w:val="single" w:color="B8C0AE" w:sz="4"/>
-              <w:bottom w:val="single" w:color="B8C0AE" w:sz="4"/>
-              <w:right w:val="single" w:color="B8C0AE" w:sz="4"/>
-            </w:tcBorders>
-            <w:tcMar>
-              <w:top w:type="dxa" w:w="70"/>
-              <w:left w:type="dxa" w:w="100"/>
-              <w:bottom w:type="dxa" w:w="70"/>
-              <w:right w:type="dxa" w:w="100"/>
-            </w:tcMar>
-          </w:tcPr>
-          <w:p>
-            <w:pPr>
-              <w:spacing w:after="80"/>
-            </w:pPr>
-            <w:r>
-              <w:rPr>
-                <w:rFonts w:ascii="Arial" w:cs="Arial" w:eastAsia="Arial" w:hAnsi="Arial"/>
-                <w:sz w:val="20"/>
-                <w:szCs w:val="20"/>
-              </w:rPr>
-              <w:t xml:space="preserve">5.4</w:t>
-            </w:r>
-          </w:p>
-        </w:tc>
-        <w:tc>
-          <w:tcPr>
-            <w:tcW w:type="dxa" w:w="3000"/>
-            <w:tcBorders>
-              <w:top w:val="single" w:color="B8C0AE" w:sz="4"/>
-              <w:left w:val="single" w:color="B8C0AE" w:sz="4"/>
-              <w:bottom w:val="single" w:color="B8C0AE" w:sz="4"/>
-              <w:right w:val="single" w:color="B8C0AE" w:sz="4"/>
-            </w:tcBorders>
-            <w:tcMar>
-              <w:top w:type="dxa" w:w="70"/>
-              <w:left w:type="dxa" w:w="100"/>
-              <w:bottom w:type="dxa" w:w="70"/>
-              <w:right w:type="dxa" w:w="100"/>
-            </w:tcMar>
-          </w:tcPr>
-          <w:p>
-            <w:pPr>
-              <w:spacing w:after="80"/>
-            </w:pPr>
-            <w:r>
-              <w:rPr>
-                <w:rFonts w:ascii="Arial" w:cs="Arial" w:eastAsia="Arial" w:hAnsi="Arial"/>
-                <w:b/>
-                <w:bCs/>
-                <w:sz w:val="20"/>
-                <w:szCs w:val="20"/>
-              </w:rPr>
-              <w:t xml:space="preserve">Abonnés à l’info-lettre</w:t>
-            </w:r>
-          </w:p>
-        </w:tc>
-        <w:tc>
-          <w:tcPr>
-            <w:tcW w:type="dxa" w:w="5800"/>
-            <w:tcBorders>
-              <w:top w:val="single" w:color="B8C0AE" w:sz="4"/>
-              <w:left w:val="single" w:color="B8C0AE" w:sz="4"/>
-              <w:bottom w:val="single" w:color="B8C0AE" w:sz="4"/>
-              <w:right w:val="single" w:color="B8C0AE" w:sz="4"/>
-            </w:tcBorders>
-            <w:shd w:fill="EEF0E8" w:color="auto" w:val="clear"/>
-            <w:tcMar>
-              <w:top w:type="dxa" w:w="70"/>
-              <w:left w:type="dxa" w:w="100"/>
-              <w:bottom w:type="dxa" w:w="70"/>
-              <w:right w:type="dxa" w:w="100"/>
-            </w:tcMar>
-          </w:tcPr>
-          <w:p>
-            <w:pPr>
-              <w:spacing w:after="80"/>
-            </w:pPr>
-            <w:r>
-              <w:rPr>
-                <w:rFonts w:ascii="Arial" w:cs="Arial" w:eastAsia="Arial" w:hAnsi="Arial"/>
-                <w:sz w:val="20"/>
-                <w:szCs w:val="20"/>
-              </w:rPr>
-              <w:t xml:space="preserve">Proposition : jusqu’au désabonnement, puis 1 an (preuve du désabonnement).</w:t>
-            </w:r>
-          </w:p>
-        </w:tc>
-        <w:tc>
-          <w:tcPr>
-            <w:tcW w:type="dxa" w:w="5438"/>
-            <w:tcBorders>
-              <w:top w:val="single" w:color="B8C0AE" w:sz="4"/>
-              <w:left w:val="single" w:color="B8C0AE" w:sz="4"/>
-              <w:bottom w:val="single" w:color="B8C0AE" w:sz="4"/>
-              <w:right w:val="single" w:color="B8C0AE" w:sz="4"/>
-            </w:tcBorders>
-            <w:shd w:fill="FFF3C4" w:color="auto" w:val="clear"/>
-            <w:tcMar>
-              <w:top w:type="dxa" w:w="70"/>
-              <w:left w:type="dxa" w:w="100"/>
-              <w:bottom w:type="dxa" w:w="70"/>
-              <w:right w:type="dxa" w:w="100"/>
-            </w:tcMar>
-          </w:tcPr>
-          <w:p>
-            <w:pPr>
-              <w:spacing w:after="80"/>
-            </w:pPr>
-            <w:r>
-              <w:rPr>
-                <w:rFonts w:ascii="Arial" w:cs="Arial" w:eastAsia="Arial" w:hAnsi="Arial"/>
-                <w:sz w:val="20"/>
-                <w:szCs w:val="20"/>
-              </w:rPr>
-              <w:t xml:space="preserve"/>
-            </w:r>
-          </w:p>
-        </w:tc>
-      </w:tr>
-      <w:tr>
-        <w:trPr>
-          <w:cantSplit/>
-        </w:trPr>
-        <w:tc>
-          <w:tcPr>
-            <w:tcW w:type="dxa" w:w="600"/>
-            <w:tcBorders>
-              <w:top w:val="single" w:color="B8C0AE" w:sz="4"/>
-              <w:left w:val="single" w:color="B8C0AE" w:sz="4"/>
-              <w:bottom w:val="single" w:color="B8C0AE" w:sz="4"/>
-              <w:right w:val="single" w:color="B8C0AE" w:sz="4"/>
-            </w:tcBorders>
-            <w:tcMar>
-              <w:top w:type="dxa" w:w="70"/>
-              <w:left w:type="dxa" w:w="100"/>
-              <w:bottom w:type="dxa" w:w="70"/>
-              <w:right w:type="dxa" w:w="100"/>
-            </w:tcMar>
-          </w:tcPr>
-          <w:p>
-            <w:pPr>
-              <w:spacing w:after="80"/>
-            </w:pPr>
-            <w:r>
-              <w:rPr>
-                <w:rFonts w:ascii="Arial" w:cs="Arial" w:eastAsia="Arial" w:hAnsi="Arial"/>
-                <w:sz w:val="20"/>
-                <w:szCs w:val="20"/>
-              </w:rPr>
-              <w:t xml:space="preserve">5.5</w:t>
-            </w:r>
-          </w:p>
-        </w:tc>
-        <w:tc>
-          <w:tcPr>
-            <w:tcW w:type="dxa" w:w="3000"/>
-            <w:tcBorders>
-              <w:top w:val="single" w:color="B8C0AE" w:sz="4"/>
-              <w:left w:val="single" w:color="B8C0AE" w:sz="4"/>
-              <w:bottom w:val="single" w:color="B8C0AE" w:sz="4"/>
-              <w:right w:val="single" w:color="B8C0AE" w:sz="4"/>
-            </w:tcBorders>
-            <w:tcMar>
-              <w:top w:type="dxa" w:w="70"/>
-              <w:left w:type="dxa" w:w="100"/>
-              <w:bottom w:type="dxa" w:w="70"/>
-              <w:right w:type="dxa" w:w="100"/>
-            </w:tcMar>
-          </w:tcPr>
-          <w:p>
-            <w:pPr>
-              <w:spacing w:after="80"/>
-            </w:pPr>
-            <w:r>
-              <w:rPr>
-                <w:rFonts w:ascii="Arial" w:cs="Arial" w:eastAsia="Arial" w:hAnsi="Arial"/>
-                <w:b/>
-                <w:bCs/>
-                <w:sz w:val="20"/>
-                <w:szCs w:val="20"/>
-              </w:rPr>
-              <w:t xml:space="preserve">Journaux techniques du serveur (adresse IP, pages visitées)</w:t>
-            </w:r>
-          </w:p>
-        </w:tc>
-        <w:tc>
-          <w:tcPr>
-            <w:tcW w:type="dxa" w:w="5800"/>
-            <w:tcBorders>
-              <w:top w:val="single" w:color="B8C0AE" w:sz="4"/>
-              <w:left w:val="single" w:color="B8C0AE" w:sz="4"/>
-              <w:bottom w:val="single" w:color="B8C0AE" w:sz="4"/>
-              <w:right w:val="single" w:color="B8C0AE" w:sz="4"/>
-            </w:tcBorders>
-            <w:shd w:fill="EEF0E8" w:color="auto" w:val="clear"/>
-            <w:tcMar>
-              <w:top w:type="dxa" w:w="70"/>
-              <w:left w:type="dxa" w:w="100"/>
-              <w:bottom w:type="dxa" w:w="70"/>
-              <w:right w:type="dxa" w:w="100"/>
-            </w:tcMar>
-          </w:tcPr>
-          <w:p>
-            <w:pPr>
-              <w:spacing w:after="80"/>
-            </w:pPr>
-            <w:r>
-              <w:rPr>
-                <w:rFonts w:ascii="Arial" w:cs="Arial" w:eastAsia="Arial" w:hAnsi="Arial"/>
-                <w:sz w:val="20"/>
-                <w:szCs w:val="20"/>
-              </w:rPr>
-              <w:t xml:space="preserve">Proposition : 12 mois au plus. À confirmer d’après les réglages de l’hébergeur LWS.</w:t>
-            </w:r>
-          </w:p>
-        </w:tc>
-        <w:tc>
-          <w:tcPr>
-            <w:tcW w:type="dxa" w:w="5438"/>
-            <w:tcBorders>
-              <w:top w:val="single" w:color="B8C0AE" w:sz="4"/>
-              <w:left w:val="single" w:color="B8C0AE" w:sz="4"/>
-              <w:bottom w:val="single" w:color="B8C0AE" w:sz="4"/>
-              <w:right w:val="single" w:color="B8C0AE" w:sz="4"/>
-            </w:tcBorders>
-            <w:shd w:fill="FFF3C4" w:color="auto" w:val="clear"/>
+              <w:top w:val="single" w:color="000000" w:sz="4"/>
+              <w:left w:val="single" w:color="000000" w:sz="4"/>
+              <w:bottom w:val="single" w:color="000000" w:sz="4"/>
+              <w:right w:val="single" w:color="000000" w:sz="4"/>
+            </w:tcBorders>
             <w:tcMar>
               <w:top w:type="dxa" w:w="70"/>
               <w:left w:type="dxa" w:w="100"/>
@@ -3458,1008 +3081,6 @@
           <w:rFonts w:ascii="Arial" w:cs="Arial" w:eastAsia="Arial" w:hAnsi="Arial"/>
           <w:b/>
           <w:bCs/>
-          <w:color w:val="2F4A2C"/>
-          <w:sz w:val="26"/>
-          <w:szCs w:val="26"/>
-        </w:rPr>
-        <w:t xml:space="preserve">6. Cookies et mesure d’audience</w:t>
-      </w:r>
-    </w:p>
-    <w:tbl>
-      <w:tblPr>
-        <w:tblW w:type="dxa" w:w="14838"/>
-        <w:tblBorders>
-          <w:top w:val="single" w:color="auto" w:sz="4"/>
-          <w:left w:val="single" w:color="auto" w:sz="4"/>
-          <w:bottom w:val="single" w:color="auto" w:sz="4"/>
-          <w:right w:val="single" w:color="auto" w:sz="4"/>
-          <w:insideH w:val="single" w:color="auto" w:sz="4"/>
-          <w:insideV w:val="single" w:color="auto" w:sz="4"/>
-        </w:tblBorders>
-      </w:tblPr>
-      <w:tblGrid>
-        <w:gridCol w:w="600"/>
-        <w:gridCol w:w="3000"/>
-        <w:gridCol w:w="5800"/>
-        <w:gridCol w:w="5438"/>
-      </w:tblGrid>
-      <w:tr>
-        <w:trPr>
-          <w:tblHeader/>
-        </w:trPr>
-        <w:tc>
-          <w:tcPr>
-            <w:tcW w:type="dxa" w:w="600"/>
-            <w:tcBorders>
-              <w:top w:val="single" w:color="B8C0AE" w:sz="4"/>
-              <w:left w:val="single" w:color="B8C0AE" w:sz="4"/>
-              <w:bottom w:val="single" w:color="B8C0AE" w:sz="4"/>
-              <w:right w:val="single" w:color="B8C0AE" w:sz="4"/>
-            </w:tcBorders>
-            <w:shd w:fill="2F4A2C" w:color="auto" w:val="clear"/>
-            <w:tcMar>
-              <w:top w:type="dxa" w:w="70"/>
-              <w:left w:type="dxa" w:w="100"/>
-              <w:bottom w:type="dxa" w:w="70"/>
-              <w:right w:type="dxa" w:w="100"/>
-            </w:tcMar>
-          </w:tcPr>
-          <w:p>
-            <w:pPr>
-              <w:spacing w:after="80"/>
-            </w:pPr>
-            <w:r>
-              <w:rPr>
-                <w:rFonts w:ascii="Arial" w:cs="Arial" w:eastAsia="Arial" w:hAnsi="Arial"/>
-                <w:b/>
-                <w:bCs/>
-                <w:color w:val="FFFFFF"/>
-                <w:sz w:val="20"/>
-                <w:szCs w:val="20"/>
-              </w:rPr>
-              <w:t xml:space="preserve">N°</w:t>
-            </w:r>
-          </w:p>
-        </w:tc>
-        <w:tc>
-          <w:tcPr>
-            <w:tcW w:type="dxa" w:w="3000"/>
-            <w:tcBorders>
-              <w:top w:val="single" w:color="B8C0AE" w:sz="4"/>
-              <w:left w:val="single" w:color="B8C0AE" w:sz="4"/>
-              <w:bottom w:val="single" w:color="B8C0AE" w:sz="4"/>
-              <w:right w:val="single" w:color="B8C0AE" w:sz="4"/>
-            </w:tcBorders>
-            <w:shd w:fill="2F4A2C" w:color="auto" w:val="clear"/>
-            <w:tcMar>
-              <w:top w:type="dxa" w:w="70"/>
-              <w:left w:type="dxa" w:w="100"/>
-              <w:bottom w:type="dxa" w:w="70"/>
-              <w:right w:type="dxa" w:w="100"/>
-            </w:tcMar>
-          </w:tcPr>
-          <w:p>
-            <w:pPr>
-              <w:spacing w:after="80"/>
-            </w:pPr>
-            <w:r>
-              <w:rPr>
-                <w:rFonts w:ascii="Arial" w:cs="Arial" w:eastAsia="Arial" w:hAnsi="Arial"/>
-                <w:b/>
-                <w:bCs/>
-                <w:color w:val="FFFFFF"/>
-                <w:sz w:val="20"/>
-                <w:szCs w:val="20"/>
-              </w:rPr>
-              <w:t xml:space="preserve">Information demandée</w:t>
-            </w:r>
-          </w:p>
-        </w:tc>
-        <w:tc>
-          <w:tcPr>
-            <w:tcW w:type="dxa" w:w="5800"/>
-            <w:tcBorders>
-              <w:top w:val="single" w:color="B8C0AE" w:sz="4"/>
-              <w:left w:val="single" w:color="B8C0AE" w:sz="4"/>
-              <w:bottom w:val="single" w:color="B8C0AE" w:sz="4"/>
-              <w:right w:val="single" w:color="B8C0AE" w:sz="4"/>
-            </w:tcBorders>
-            <w:shd w:fill="2F4A2C" w:color="auto" w:val="clear"/>
-            <w:tcMar>
-              <w:top w:type="dxa" w:w="70"/>
-              <w:left w:type="dxa" w:w="100"/>
-              <w:bottom w:type="dxa" w:w="70"/>
-              <w:right w:type="dxa" w:w="100"/>
-            </w:tcMar>
-          </w:tcPr>
-          <w:p>
-            <w:pPr>
-              <w:spacing w:after="80"/>
-            </w:pPr>
-            <w:r>
-              <w:rPr>
-                <w:rFonts w:ascii="Arial" w:cs="Arial" w:eastAsia="Arial" w:hAnsi="Arial"/>
-                <w:b/>
-                <w:bCs/>
-                <w:color w:val="FFFFFF"/>
-                <w:sz w:val="20"/>
-                <w:szCs w:val="20"/>
-              </w:rPr>
-              <w:t xml:space="preserve">Ce que nous savons / notre proposition</w:t>
-            </w:r>
-          </w:p>
-        </w:tc>
-        <w:tc>
-          <w:tcPr>
-            <w:tcW w:type="dxa" w:w="5438"/>
-            <w:tcBorders>
-              <w:top w:val="single" w:color="B8C0AE" w:sz="4"/>
-              <w:left w:val="single" w:color="B8C0AE" w:sz="4"/>
-              <w:bottom w:val="single" w:color="B8C0AE" w:sz="4"/>
-              <w:right w:val="single" w:color="B8C0AE" w:sz="4"/>
-            </w:tcBorders>
-            <w:shd w:fill="2F4A2C" w:color="auto" w:val="clear"/>
-            <w:tcMar>
-              <w:top w:type="dxa" w:w="70"/>
-              <w:left w:type="dxa" w:w="100"/>
-              <w:bottom w:type="dxa" w:w="70"/>
-              <w:right w:type="dxa" w:w="100"/>
-            </w:tcMar>
-          </w:tcPr>
-          <w:p>
-            <w:pPr>
-              <w:spacing w:after="80"/>
-            </w:pPr>
-            <w:r>
-              <w:rPr>
-                <w:rFonts w:ascii="Arial" w:cs="Arial" w:eastAsia="Arial" w:hAnsi="Arial"/>
-                <w:b/>
-                <w:bCs/>
-                <w:color w:val="FFFFFF"/>
-                <w:sz w:val="20"/>
-                <w:szCs w:val="20"/>
-              </w:rPr>
-              <w:t xml:space="preserve">Correction du groupe (à remplir si différent)</w:t>
-            </w:r>
-          </w:p>
-        </w:tc>
-      </w:tr>
-      <w:tr>
-        <w:trPr>
-          <w:cantSplit/>
-        </w:trPr>
-        <w:tc>
-          <w:tcPr>
-            <w:tcW w:type="dxa" w:w="600"/>
-            <w:tcBorders>
-              <w:top w:val="single" w:color="B8C0AE" w:sz="4"/>
-              <w:left w:val="single" w:color="B8C0AE" w:sz="4"/>
-              <w:bottom w:val="single" w:color="B8C0AE" w:sz="4"/>
-              <w:right w:val="single" w:color="B8C0AE" w:sz="4"/>
-            </w:tcBorders>
-            <w:tcMar>
-              <w:top w:type="dxa" w:w="70"/>
-              <w:left w:type="dxa" w:w="100"/>
-              <w:bottom w:type="dxa" w:w="70"/>
-              <w:right w:type="dxa" w:w="100"/>
-            </w:tcMar>
-          </w:tcPr>
-          <w:p>
-            <w:pPr>
-              <w:spacing w:after="80"/>
-            </w:pPr>
-            <w:r>
-              <w:rPr>
-                <w:rFonts w:ascii="Arial" w:cs="Arial" w:eastAsia="Arial" w:hAnsi="Arial"/>
-                <w:sz w:val="20"/>
-                <w:szCs w:val="20"/>
-              </w:rPr>
-              <w:t xml:space="preserve">6.1</w:t>
-            </w:r>
-          </w:p>
-        </w:tc>
-        <w:tc>
-          <w:tcPr>
-            <w:tcW w:type="dxa" w:w="3000"/>
-            <w:tcBorders>
-              <w:top w:val="single" w:color="B8C0AE" w:sz="4"/>
-              <w:left w:val="single" w:color="B8C0AE" w:sz="4"/>
-              <w:bottom w:val="single" w:color="B8C0AE" w:sz="4"/>
-              <w:right w:val="single" w:color="B8C0AE" w:sz="4"/>
-            </w:tcBorders>
-            <w:tcMar>
-              <w:top w:type="dxa" w:w="70"/>
-              <w:left w:type="dxa" w:w="100"/>
-              <w:bottom w:type="dxa" w:w="70"/>
-              <w:right w:type="dxa" w:w="100"/>
-            </w:tcMar>
-          </w:tcPr>
-          <w:p>
-            <w:pPr>
-              <w:spacing w:after="80"/>
-            </w:pPr>
-            <w:r>
-              <w:rPr>
-                <w:rFonts w:ascii="Arial" w:cs="Arial" w:eastAsia="Arial" w:hAnsi="Arial"/>
-                <w:b/>
-                <w:bCs/>
-                <w:sz w:val="20"/>
-                <w:szCs w:val="20"/>
-              </w:rPr>
-              <w:t xml:space="preserve">Mesure d’audience</w:t>
-            </w:r>
-          </w:p>
-        </w:tc>
-        <w:tc>
-          <w:tcPr>
-            <w:tcW w:type="dxa" w:w="5800"/>
-            <w:tcBorders>
-              <w:top w:val="single" w:color="B8C0AE" w:sz="4"/>
-              <w:left w:val="single" w:color="B8C0AE" w:sz="4"/>
-              <w:bottom w:val="single" w:color="B8C0AE" w:sz="4"/>
-              <w:right w:val="single" w:color="B8C0AE" w:sz="4"/>
-            </w:tcBorders>
-            <w:shd w:fill="EEF0E8" w:color="auto" w:val="clear"/>
-            <w:tcMar>
-              <w:top w:type="dxa" w:w="70"/>
-              <w:left w:type="dxa" w:w="100"/>
-              <w:bottom w:type="dxa" w:w="70"/>
-              <w:right w:type="dxa" w:w="100"/>
-            </w:tcMar>
-          </w:tcPr>
-          <w:p>
-            <w:pPr>
-              <w:spacing w:after="80"/>
-            </w:pPr>
-            <w:r>
-              <w:rPr>
-                <w:rFonts w:ascii="Arial" w:cs="Arial" w:eastAsia="Arial" w:hAnsi="Arial"/>
-                <w:sz w:val="20"/>
-                <w:szCs w:val="20"/>
-              </w:rPr>
-              <w:t xml:space="preserve">Aucun outil de statistiques n’est installé aujourd’hui. Le groupe souhaite-t-il en ajouter un (Matomo, Plausible, Google Analytics…) ? Si oui, lequel ?</w:t>
-            </w:r>
-          </w:p>
-        </w:tc>
-        <w:tc>
-          <w:tcPr>
-            <w:tcW w:type="dxa" w:w="5438"/>
-            <w:tcBorders>
-              <w:top w:val="single" w:color="B8C0AE" w:sz="4"/>
-              <w:left w:val="single" w:color="B8C0AE" w:sz="4"/>
-              <w:bottom w:val="single" w:color="B8C0AE" w:sz="4"/>
-              <w:right w:val="single" w:color="B8C0AE" w:sz="4"/>
-            </w:tcBorders>
-            <w:shd w:fill="FFF3C4" w:color="auto" w:val="clear"/>
-            <w:tcMar>
-              <w:top w:type="dxa" w:w="70"/>
-              <w:left w:type="dxa" w:w="100"/>
-              <w:bottom w:type="dxa" w:w="70"/>
-              <w:right w:type="dxa" w:w="100"/>
-            </w:tcMar>
-          </w:tcPr>
-          <w:p>
-            <w:pPr>
-              <w:spacing w:after="80"/>
-            </w:pPr>
-            <w:r>
-              <w:rPr>
-                <w:rFonts w:ascii="Arial" w:cs="Arial" w:eastAsia="Arial" w:hAnsi="Arial"/>
-                <w:sz w:val="20"/>
-                <w:szCs w:val="20"/>
-              </w:rPr>
-              <w:t xml:space="preserve"/>
-            </w:r>
-          </w:p>
-        </w:tc>
-      </w:tr>
-      <w:tr>
-        <w:trPr>
-          <w:cantSplit/>
-        </w:trPr>
-        <w:tc>
-          <w:tcPr>
-            <w:tcW w:type="dxa" w:w="600"/>
-            <w:tcBorders>
-              <w:top w:val="single" w:color="B8C0AE" w:sz="4"/>
-              <w:left w:val="single" w:color="B8C0AE" w:sz="4"/>
-              <w:bottom w:val="single" w:color="B8C0AE" w:sz="4"/>
-              <w:right w:val="single" w:color="B8C0AE" w:sz="4"/>
-            </w:tcBorders>
-            <w:tcMar>
-              <w:top w:type="dxa" w:w="70"/>
-              <w:left w:type="dxa" w:w="100"/>
-              <w:bottom w:type="dxa" w:w="70"/>
-              <w:right w:type="dxa" w:w="100"/>
-            </w:tcMar>
-          </w:tcPr>
-          <w:p>
-            <w:pPr>
-              <w:spacing w:after="80"/>
-            </w:pPr>
-            <w:r>
-              <w:rPr>
-                <w:rFonts w:ascii="Arial" w:cs="Arial" w:eastAsia="Arial" w:hAnsi="Arial"/>
-                <w:sz w:val="20"/>
-                <w:szCs w:val="20"/>
-              </w:rPr>
-              <w:t xml:space="preserve">6.2</w:t>
-            </w:r>
-          </w:p>
-        </w:tc>
-        <w:tc>
-          <w:tcPr>
-            <w:tcW w:type="dxa" w:w="3000"/>
-            <w:tcBorders>
-              <w:top w:val="single" w:color="B8C0AE" w:sz="4"/>
-              <w:left w:val="single" w:color="B8C0AE" w:sz="4"/>
-              <w:bottom w:val="single" w:color="B8C0AE" w:sz="4"/>
-              <w:right w:val="single" w:color="B8C0AE" w:sz="4"/>
-            </w:tcBorders>
-            <w:tcMar>
-              <w:top w:type="dxa" w:w="70"/>
-              <w:left w:type="dxa" w:w="100"/>
-              <w:bottom w:type="dxa" w:w="70"/>
-              <w:right w:type="dxa" w:w="100"/>
-            </w:tcMar>
-          </w:tcPr>
-          <w:p>
-            <w:pPr>
-              <w:spacing w:after="80"/>
-            </w:pPr>
-            <w:r>
-              <w:rPr>
-                <w:rFonts w:ascii="Arial" w:cs="Arial" w:eastAsia="Arial" w:hAnsi="Arial"/>
-                <w:b/>
-                <w:bCs/>
-                <w:sz w:val="20"/>
-                <w:szCs w:val="20"/>
-              </w:rPr>
-              <w:t xml:space="preserve">Services externes chargés par les pages</w:t>
-            </w:r>
-          </w:p>
-        </w:tc>
-        <w:tc>
-          <w:tcPr>
-            <w:tcW w:type="dxa" w:w="5800"/>
-            <w:tcBorders>
-              <w:top w:val="single" w:color="B8C0AE" w:sz="4"/>
-              <w:left w:val="single" w:color="B8C0AE" w:sz="4"/>
-              <w:bottom w:val="single" w:color="B8C0AE" w:sz="4"/>
-              <w:right w:val="single" w:color="B8C0AE" w:sz="4"/>
-            </w:tcBorders>
-            <w:shd w:fill="EEF0E8" w:color="auto" w:val="clear"/>
-            <w:tcMar>
-              <w:top w:type="dxa" w:w="70"/>
-              <w:left w:type="dxa" w:w="100"/>
-              <w:bottom w:type="dxa" w:w="70"/>
-              <w:right w:type="dxa" w:w="100"/>
-            </w:tcMar>
-          </w:tcPr>
-          <w:p>
-            <w:pPr>
-              <w:spacing w:after="80"/>
-            </w:pPr>
-            <w:r>
-              <w:rPr>
-                <w:rFonts w:ascii="Arial" w:cs="Arial" w:eastAsia="Arial" w:hAnsi="Arial"/>
-                <w:sz w:val="20"/>
-                <w:szCs w:val="20"/>
-              </w:rPr>
-              <w:t xml:space="preserve">Polices et bibliothèques fournies par Google Fonts, jsDelivr, Cloudflare (cdnjs) et jQuery. Ces services reçoivent l’adresse IP des visiteurs. Proposition : l’indiquer dans la politique de cookies, ce qui est déjà fait.</w:t>
-            </w:r>
-          </w:p>
-        </w:tc>
-        <w:tc>
-          <w:tcPr>
-            <w:tcW w:type="dxa" w:w="5438"/>
-            <w:tcBorders>
-              <w:top w:val="single" w:color="B8C0AE" w:sz="4"/>
-              <w:left w:val="single" w:color="B8C0AE" w:sz="4"/>
-              <w:bottom w:val="single" w:color="B8C0AE" w:sz="4"/>
-              <w:right w:val="single" w:color="B8C0AE" w:sz="4"/>
-            </w:tcBorders>
-            <w:shd w:fill="FFF3C4" w:color="auto" w:val="clear"/>
-            <w:tcMar>
-              <w:top w:type="dxa" w:w="70"/>
-              <w:left w:type="dxa" w:w="100"/>
-              <w:bottom w:type="dxa" w:w="70"/>
-              <w:right w:type="dxa" w:w="100"/>
-            </w:tcMar>
-          </w:tcPr>
-          <w:p>
-            <w:pPr>
-              <w:spacing w:after="80"/>
-            </w:pPr>
-            <w:r>
-              <w:rPr>
-                <w:rFonts w:ascii="Arial" w:cs="Arial" w:eastAsia="Arial" w:hAnsi="Arial"/>
-                <w:sz w:val="20"/>
-                <w:szCs w:val="20"/>
-              </w:rPr>
-              <w:t xml:space="preserve"/>
-            </w:r>
-          </w:p>
-        </w:tc>
-      </w:tr>
-    </w:tbl>
-    <w:p>
-      <w:pPr>
-        <w:pStyle w:val="Heading1"/>
-        <w:keepNext/>
-        <w:spacing w:after="120" w:before="320"/>
-      </w:pPr>
-      <w:r>
-        <w:rPr>
-          <w:rFonts w:ascii="Arial" w:cs="Arial" w:eastAsia="Arial" w:hAnsi="Arial"/>
-          <w:b/>
-          <w:bCs/>
-          <w:color w:val="2F4A2C"/>
-          <w:sz w:val="26"/>
-          <w:szCs w:val="26"/>
-        </w:rPr>
-        <w:t xml:space="preserve">7. Contenus et droit applicable</w:t>
-      </w:r>
-    </w:p>
-    <w:tbl>
-      <w:tblPr>
-        <w:tblW w:type="dxa" w:w="14838"/>
-        <w:tblBorders>
-          <w:top w:val="single" w:color="auto" w:sz="4"/>
-          <w:left w:val="single" w:color="auto" w:sz="4"/>
-          <w:bottom w:val="single" w:color="auto" w:sz="4"/>
-          <w:right w:val="single" w:color="auto" w:sz="4"/>
-          <w:insideH w:val="single" w:color="auto" w:sz="4"/>
-          <w:insideV w:val="single" w:color="auto" w:sz="4"/>
-        </w:tblBorders>
-      </w:tblPr>
-      <w:tblGrid>
-        <w:gridCol w:w="600"/>
-        <w:gridCol w:w="3000"/>
-        <w:gridCol w:w="5800"/>
-        <w:gridCol w:w="5438"/>
-      </w:tblGrid>
-      <w:tr>
-        <w:trPr>
-          <w:tblHeader/>
-        </w:trPr>
-        <w:tc>
-          <w:tcPr>
-            <w:tcW w:type="dxa" w:w="600"/>
-            <w:tcBorders>
-              <w:top w:val="single" w:color="B8C0AE" w:sz="4"/>
-              <w:left w:val="single" w:color="B8C0AE" w:sz="4"/>
-              <w:bottom w:val="single" w:color="B8C0AE" w:sz="4"/>
-              <w:right w:val="single" w:color="B8C0AE" w:sz="4"/>
-            </w:tcBorders>
-            <w:shd w:fill="2F4A2C" w:color="auto" w:val="clear"/>
-            <w:tcMar>
-              <w:top w:type="dxa" w:w="70"/>
-              <w:left w:type="dxa" w:w="100"/>
-              <w:bottom w:type="dxa" w:w="70"/>
-              <w:right w:type="dxa" w:w="100"/>
-            </w:tcMar>
-          </w:tcPr>
-          <w:p>
-            <w:pPr>
-              <w:spacing w:after="80"/>
-            </w:pPr>
-            <w:r>
-              <w:rPr>
-                <w:rFonts w:ascii="Arial" w:cs="Arial" w:eastAsia="Arial" w:hAnsi="Arial"/>
-                <w:b/>
-                <w:bCs/>
-                <w:color w:val="FFFFFF"/>
-                <w:sz w:val="20"/>
-                <w:szCs w:val="20"/>
-              </w:rPr>
-              <w:t xml:space="preserve">N°</w:t>
-            </w:r>
-          </w:p>
-        </w:tc>
-        <w:tc>
-          <w:tcPr>
-            <w:tcW w:type="dxa" w:w="3000"/>
-            <w:tcBorders>
-              <w:top w:val="single" w:color="B8C0AE" w:sz="4"/>
-              <w:left w:val="single" w:color="B8C0AE" w:sz="4"/>
-              <w:bottom w:val="single" w:color="B8C0AE" w:sz="4"/>
-              <w:right w:val="single" w:color="B8C0AE" w:sz="4"/>
-            </w:tcBorders>
-            <w:shd w:fill="2F4A2C" w:color="auto" w:val="clear"/>
-            <w:tcMar>
-              <w:top w:type="dxa" w:w="70"/>
-              <w:left w:type="dxa" w:w="100"/>
-              <w:bottom w:type="dxa" w:w="70"/>
-              <w:right w:type="dxa" w:w="100"/>
-            </w:tcMar>
-          </w:tcPr>
-          <w:p>
-            <w:pPr>
-              <w:spacing w:after="80"/>
-            </w:pPr>
-            <w:r>
-              <w:rPr>
-                <w:rFonts w:ascii="Arial" w:cs="Arial" w:eastAsia="Arial" w:hAnsi="Arial"/>
-                <w:b/>
-                <w:bCs/>
-                <w:color w:val="FFFFFF"/>
-                <w:sz w:val="20"/>
-                <w:szCs w:val="20"/>
-              </w:rPr>
-              <w:t xml:space="preserve">Information demandée</w:t>
-            </w:r>
-          </w:p>
-        </w:tc>
-        <w:tc>
-          <w:tcPr>
-            <w:tcW w:type="dxa" w:w="5800"/>
-            <w:tcBorders>
-              <w:top w:val="single" w:color="B8C0AE" w:sz="4"/>
-              <w:left w:val="single" w:color="B8C0AE" w:sz="4"/>
-              <w:bottom w:val="single" w:color="B8C0AE" w:sz="4"/>
-              <w:right w:val="single" w:color="B8C0AE" w:sz="4"/>
-            </w:tcBorders>
-            <w:shd w:fill="2F4A2C" w:color="auto" w:val="clear"/>
-            <w:tcMar>
-              <w:top w:type="dxa" w:w="70"/>
-              <w:left w:type="dxa" w:w="100"/>
-              <w:bottom w:type="dxa" w:w="70"/>
-              <w:right w:type="dxa" w:w="100"/>
-            </w:tcMar>
-          </w:tcPr>
-          <w:p>
-            <w:pPr>
-              <w:spacing w:after="80"/>
-            </w:pPr>
-            <w:r>
-              <w:rPr>
-                <w:rFonts w:ascii="Arial" w:cs="Arial" w:eastAsia="Arial" w:hAnsi="Arial"/>
-                <w:b/>
-                <w:bCs/>
-                <w:color w:val="FFFFFF"/>
-                <w:sz w:val="20"/>
-                <w:szCs w:val="20"/>
-              </w:rPr>
-              <w:t xml:space="preserve">Ce que nous savons / notre proposition</w:t>
-            </w:r>
-          </w:p>
-        </w:tc>
-        <w:tc>
-          <w:tcPr>
-            <w:tcW w:type="dxa" w:w="5438"/>
-            <w:tcBorders>
-              <w:top w:val="single" w:color="B8C0AE" w:sz="4"/>
-              <w:left w:val="single" w:color="B8C0AE" w:sz="4"/>
-              <w:bottom w:val="single" w:color="B8C0AE" w:sz="4"/>
-              <w:right w:val="single" w:color="B8C0AE" w:sz="4"/>
-            </w:tcBorders>
-            <w:shd w:fill="2F4A2C" w:color="auto" w:val="clear"/>
-            <w:tcMar>
-              <w:top w:type="dxa" w:w="70"/>
-              <w:left w:type="dxa" w:w="100"/>
-              <w:bottom w:type="dxa" w:w="70"/>
-              <w:right w:type="dxa" w:w="100"/>
-            </w:tcMar>
-          </w:tcPr>
-          <w:p>
-            <w:pPr>
-              <w:spacing w:after="80"/>
-            </w:pPr>
-            <w:r>
-              <w:rPr>
-                <w:rFonts w:ascii="Arial" w:cs="Arial" w:eastAsia="Arial" w:hAnsi="Arial"/>
-                <w:b/>
-                <w:bCs/>
-                <w:color w:val="FFFFFF"/>
-                <w:sz w:val="20"/>
-                <w:szCs w:val="20"/>
-              </w:rPr>
-              <w:t xml:space="preserve">Correction du groupe (à remplir si différent)</w:t>
-            </w:r>
-          </w:p>
-        </w:tc>
-      </w:tr>
-      <w:tr>
-        <w:trPr>
-          <w:cantSplit/>
-        </w:trPr>
-        <w:tc>
-          <w:tcPr>
-            <w:tcW w:type="dxa" w:w="600"/>
-            <w:tcBorders>
-              <w:top w:val="single" w:color="B8C0AE" w:sz="4"/>
-              <w:left w:val="single" w:color="B8C0AE" w:sz="4"/>
-              <w:bottom w:val="single" w:color="B8C0AE" w:sz="4"/>
-              <w:right w:val="single" w:color="B8C0AE" w:sz="4"/>
-            </w:tcBorders>
-            <w:tcMar>
-              <w:top w:type="dxa" w:w="70"/>
-              <w:left w:type="dxa" w:w="100"/>
-              <w:bottom w:type="dxa" w:w="70"/>
-              <w:right w:type="dxa" w:w="100"/>
-            </w:tcMar>
-          </w:tcPr>
-          <w:p>
-            <w:pPr>
-              <w:spacing w:after="80"/>
-            </w:pPr>
-            <w:r>
-              <w:rPr>
-                <w:rFonts w:ascii="Arial" w:cs="Arial" w:eastAsia="Arial" w:hAnsi="Arial"/>
-                <w:sz w:val="20"/>
-                <w:szCs w:val="20"/>
-              </w:rPr>
-              <w:t xml:space="preserve">7.1</w:t>
-            </w:r>
-          </w:p>
-        </w:tc>
-        <w:tc>
-          <w:tcPr>
-            <w:tcW w:type="dxa" w:w="3000"/>
-            <w:tcBorders>
-              <w:top w:val="single" w:color="B8C0AE" w:sz="4"/>
-              <w:left w:val="single" w:color="B8C0AE" w:sz="4"/>
-              <w:bottom w:val="single" w:color="B8C0AE" w:sz="4"/>
-              <w:right w:val="single" w:color="B8C0AE" w:sz="4"/>
-            </w:tcBorders>
-            <w:tcMar>
-              <w:top w:type="dxa" w:w="70"/>
-              <w:left w:type="dxa" w:w="100"/>
-              <w:bottom w:type="dxa" w:w="70"/>
-              <w:right w:type="dxa" w:w="100"/>
-            </w:tcMar>
-          </w:tcPr>
-          <w:p>
-            <w:pPr>
-              <w:spacing w:after="80"/>
-            </w:pPr>
-            <w:r>
-              <w:rPr>
-                <w:rFonts w:ascii="Arial" w:cs="Arial" w:eastAsia="Arial" w:hAnsi="Arial"/>
-                <w:b/>
-                <w:bCs/>
-                <w:sz w:val="20"/>
-                <w:szCs w:val="20"/>
-              </w:rPr>
-              <w:t xml:space="preserve">Réutilisation des publications et photos</w:t>
-            </w:r>
-          </w:p>
-        </w:tc>
-        <w:tc>
-          <w:tcPr>
-            <w:tcW w:type="dxa" w:w="5800"/>
-            <w:tcBorders>
-              <w:top w:val="single" w:color="B8C0AE" w:sz="4"/>
-              <w:left w:val="single" w:color="B8C0AE" w:sz="4"/>
-              <w:bottom w:val="single" w:color="B8C0AE" w:sz="4"/>
-              <w:right w:val="single" w:color="B8C0AE" w:sz="4"/>
-            </w:tcBorders>
-            <w:shd w:fill="EEF0E8" w:color="auto" w:val="clear"/>
-            <w:tcMar>
-              <w:top w:type="dxa" w:w="70"/>
-              <w:left w:type="dxa" w:w="100"/>
-              <w:bottom w:type="dxa" w:w="70"/>
-              <w:right w:type="dxa" w:w="100"/>
-            </w:tcMar>
-          </w:tcPr>
-          <w:p>
-            <w:pPr>
-              <w:spacing w:after="80"/>
-            </w:pPr>
-            <w:r>
-              <w:rPr>
-                <w:rFonts w:ascii="Arial" w:cs="Arial" w:eastAsia="Arial" w:hAnsi="Arial"/>
-                <w:sz w:val="20"/>
-                <w:szCs w:val="20"/>
-              </w:rPr>
-              <w:t xml:space="preserve">Proposition : autorisation écrite préalable, sauf courtes citations avec mention de la source et de l’auteur. Le groupe préfère-t-il une licence ouverte (par exemple Creative Commons) ?</w:t>
-            </w:r>
-          </w:p>
-        </w:tc>
-        <w:tc>
-          <w:tcPr>
-            <w:tcW w:type="dxa" w:w="5438"/>
-            <w:tcBorders>
-              <w:top w:val="single" w:color="B8C0AE" w:sz="4"/>
-              <w:left w:val="single" w:color="B8C0AE" w:sz="4"/>
-              <w:bottom w:val="single" w:color="B8C0AE" w:sz="4"/>
-              <w:right w:val="single" w:color="B8C0AE" w:sz="4"/>
-            </w:tcBorders>
-            <w:shd w:fill="FFF3C4" w:color="auto" w:val="clear"/>
-            <w:tcMar>
-              <w:top w:type="dxa" w:w="70"/>
-              <w:left w:type="dxa" w:w="100"/>
-              <w:bottom w:type="dxa" w:w="70"/>
-              <w:right w:type="dxa" w:w="100"/>
-            </w:tcMar>
-          </w:tcPr>
-          <w:p>
-            <w:pPr>
-              <w:spacing w:after="80"/>
-            </w:pPr>
-            <w:r>
-              <w:rPr>
-                <w:rFonts w:ascii="Arial" w:cs="Arial" w:eastAsia="Arial" w:hAnsi="Arial"/>
-                <w:sz w:val="20"/>
-                <w:szCs w:val="20"/>
-              </w:rPr>
-              <w:t xml:space="preserve"/>
-            </w:r>
-          </w:p>
-        </w:tc>
-      </w:tr>
-      <w:tr>
-        <w:trPr>
-          <w:cantSplit/>
-        </w:trPr>
-        <w:tc>
-          <w:tcPr>
-            <w:tcW w:type="dxa" w:w="600"/>
-            <w:tcBorders>
-              <w:top w:val="single" w:color="B8C0AE" w:sz="4"/>
-              <w:left w:val="single" w:color="B8C0AE" w:sz="4"/>
-              <w:bottom w:val="single" w:color="B8C0AE" w:sz="4"/>
-              <w:right w:val="single" w:color="B8C0AE" w:sz="4"/>
-            </w:tcBorders>
-            <w:tcMar>
-              <w:top w:type="dxa" w:w="70"/>
-              <w:left w:type="dxa" w:w="100"/>
-              <w:bottom w:type="dxa" w:w="70"/>
-              <w:right w:type="dxa" w:w="100"/>
-            </w:tcMar>
-          </w:tcPr>
-          <w:p>
-            <w:pPr>
-              <w:spacing w:after="80"/>
-            </w:pPr>
-            <w:r>
-              <w:rPr>
-                <w:rFonts w:ascii="Arial" w:cs="Arial" w:eastAsia="Arial" w:hAnsi="Arial"/>
-                <w:sz w:val="20"/>
-                <w:szCs w:val="20"/>
-              </w:rPr>
-              <w:t xml:space="preserve">7.2</w:t>
-            </w:r>
-          </w:p>
-        </w:tc>
-        <w:tc>
-          <w:tcPr>
-            <w:tcW w:type="dxa" w:w="3000"/>
-            <w:tcBorders>
-              <w:top w:val="single" w:color="B8C0AE" w:sz="4"/>
-              <w:left w:val="single" w:color="B8C0AE" w:sz="4"/>
-              <w:bottom w:val="single" w:color="B8C0AE" w:sz="4"/>
-              <w:right w:val="single" w:color="B8C0AE" w:sz="4"/>
-            </w:tcBorders>
-            <w:tcMar>
-              <w:top w:type="dxa" w:w="70"/>
-              <w:left w:type="dxa" w:w="100"/>
-              <w:bottom w:type="dxa" w:w="70"/>
-              <w:right w:type="dxa" w:w="100"/>
-            </w:tcMar>
-          </w:tcPr>
-          <w:p>
-            <w:pPr>
-              <w:spacing w:after="80"/>
-            </w:pPr>
-            <w:r>
-              <w:rPr>
-                <w:rFonts w:ascii="Arial" w:cs="Arial" w:eastAsia="Arial" w:hAnsi="Arial"/>
-                <w:b/>
-                <w:bCs/>
-                <w:sz w:val="20"/>
-                <w:szCs w:val="20"/>
-              </w:rPr>
-              <w:t xml:space="preserve">Droit applicable et tribunaux compétents</w:t>
-            </w:r>
-          </w:p>
-        </w:tc>
-        <w:tc>
-          <w:tcPr>
-            <w:tcW w:type="dxa" w:w="5800"/>
-            <w:tcBorders>
-              <w:top w:val="single" w:color="B8C0AE" w:sz="4"/>
-              <w:left w:val="single" w:color="B8C0AE" w:sz="4"/>
-              <w:bottom w:val="single" w:color="B8C0AE" w:sz="4"/>
-              <w:right w:val="single" w:color="B8C0AE" w:sz="4"/>
-            </w:tcBorders>
-            <w:shd w:fill="EEF0E8" w:color="auto" w:val="clear"/>
-            <w:tcMar>
-              <w:top w:type="dxa" w:w="70"/>
-              <w:left w:type="dxa" w:w="100"/>
-              <w:bottom w:type="dxa" w:w="70"/>
-              <w:right w:type="dxa" w:w="100"/>
-            </w:tcMar>
-          </w:tcPr>
-          <w:p>
-            <w:pPr>
-              <w:spacing w:after="80"/>
-            </w:pPr>
-            <w:r>
-              <w:rPr>
-                <w:rFonts w:ascii="Arial" w:cs="Arial" w:eastAsia="Arial" w:hAnsi="Arial"/>
-                <w:sz w:val="20"/>
-                <w:szCs w:val="20"/>
-              </w:rPr>
-              <w:t xml:space="preserve">Proposition : droit malien, tribunaux de Bamako.</w:t>
-            </w:r>
-          </w:p>
-        </w:tc>
-        <w:tc>
-          <w:tcPr>
-            <w:tcW w:type="dxa" w:w="5438"/>
-            <w:tcBorders>
-              <w:top w:val="single" w:color="B8C0AE" w:sz="4"/>
-              <w:left w:val="single" w:color="B8C0AE" w:sz="4"/>
-              <w:bottom w:val="single" w:color="B8C0AE" w:sz="4"/>
-              <w:right w:val="single" w:color="B8C0AE" w:sz="4"/>
-            </w:tcBorders>
-            <w:shd w:fill="FFF3C4" w:color="auto" w:val="clear"/>
-            <w:tcMar>
-              <w:top w:type="dxa" w:w="70"/>
-              <w:left w:type="dxa" w:w="100"/>
-              <w:bottom w:type="dxa" w:w="70"/>
-              <w:right w:type="dxa" w:w="100"/>
-            </w:tcMar>
-          </w:tcPr>
-          <w:p>
-            <w:pPr>
-              <w:spacing w:after="80"/>
-            </w:pPr>
-            <w:r>
-              <w:rPr>
-                <w:rFonts w:ascii="Arial" w:cs="Arial" w:eastAsia="Arial" w:hAnsi="Arial"/>
-                <w:sz w:val="20"/>
-                <w:szCs w:val="20"/>
-              </w:rPr>
-              <w:t xml:space="preserve"/>
-            </w:r>
-          </w:p>
-        </w:tc>
-      </w:tr>
-      <w:tr>
-        <w:trPr>
-          <w:cantSplit/>
-        </w:trPr>
-        <w:tc>
-          <w:tcPr>
-            <w:tcW w:type="dxa" w:w="600"/>
-            <w:tcBorders>
-              <w:top w:val="single" w:color="B8C0AE" w:sz="4"/>
-              <w:left w:val="single" w:color="B8C0AE" w:sz="4"/>
-              <w:bottom w:val="single" w:color="B8C0AE" w:sz="4"/>
-              <w:right w:val="single" w:color="B8C0AE" w:sz="4"/>
-            </w:tcBorders>
-            <w:tcMar>
-              <w:top w:type="dxa" w:w="70"/>
-              <w:left w:type="dxa" w:w="100"/>
-              <w:bottom w:type="dxa" w:w="70"/>
-              <w:right w:type="dxa" w:w="100"/>
-            </w:tcMar>
-          </w:tcPr>
-          <w:p>
-            <w:pPr>
-              <w:spacing w:after="80"/>
-            </w:pPr>
-            <w:r>
-              <w:rPr>
-                <w:rFonts w:ascii="Arial" w:cs="Arial" w:eastAsia="Arial" w:hAnsi="Arial"/>
-                <w:sz w:val="20"/>
-                <w:szCs w:val="20"/>
-              </w:rPr>
-              <w:t xml:space="preserve">7.3</w:t>
-            </w:r>
-          </w:p>
-        </w:tc>
-        <w:tc>
-          <w:tcPr>
-            <w:tcW w:type="dxa" w:w="3000"/>
-            <w:tcBorders>
-              <w:top w:val="single" w:color="B8C0AE" w:sz="4"/>
-              <w:left w:val="single" w:color="B8C0AE" w:sz="4"/>
-              <w:bottom w:val="single" w:color="B8C0AE" w:sz="4"/>
-              <w:right w:val="single" w:color="B8C0AE" w:sz="4"/>
-            </w:tcBorders>
-            <w:tcMar>
-              <w:top w:type="dxa" w:w="70"/>
-              <w:left w:type="dxa" w:w="100"/>
-              <w:bottom w:type="dxa" w:w="70"/>
-              <w:right w:type="dxa" w:w="100"/>
-            </w:tcMar>
-          </w:tcPr>
-          <w:p>
-            <w:pPr>
-              <w:spacing w:after="80"/>
-            </w:pPr>
-            <w:r>
-              <w:rPr>
-                <w:rFonts w:ascii="Arial" w:cs="Arial" w:eastAsia="Arial" w:hAnsi="Arial"/>
-                <w:b/>
-                <w:bCs/>
-                <w:sz w:val="20"/>
-                <w:szCs w:val="20"/>
-              </w:rPr>
-              <w:t xml:space="preserve">Attribution des publications</w:t>
-            </w:r>
-          </w:p>
-        </w:tc>
-        <w:tc>
-          <w:tcPr>
-            <w:tcW w:type="dxa" w:w="5800"/>
-            <w:tcBorders>
-              <w:top w:val="single" w:color="B8C0AE" w:sz="4"/>
-              <w:left w:val="single" w:color="B8C0AE" w:sz="4"/>
-              <w:bottom w:val="single" w:color="B8C0AE" w:sz="4"/>
-              <w:right w:val="single" w:color="B8C0AE" w:sz="4"/>
-            </w:tcBorders>
-            <w:shd w:fill="EEF0E8" w:color="auto" w:val="clear"/>
-            <w:tcMar>
-              <w:top w:type="dxa" w:w="70"/>
-              <w:left w:type="dxa" w:w="100"/>
-              <w:bottom w:type="dxa" w:w="70"/>
-              <w:right w:type="dxa" w:w="100"/>
-            </w:tcMar>
-          </w:tcPr>
-          <w:p>
-            <w:pPr>
-              <w:spacing w:after="80"/>
-            </w:pPr>
-            <w:r>
-              <w:rPr>
-                <w:rFonts w:ascii="Arial" w:cs="Arial" w:eastAsia="Arial" w:hAnsi="Arial"/>
-                <w:sz w:val="20"/>
-                <w:szCs w:val="20"/>
-              </w:rPr>
-              <w:t xml:space="preserve">Toutes les actions sont faites au nom du groupe. Les auteurs des articles restent nommés dans leurs publications. Est-ce bien l’intention ?</w:t>
-            </w:r>
-          </w:p>
-        </w:tc>
-        <w:tc>
-          <w:tcPr>
-            <w:tcW w:type="dxa" w:w="5438"/>
-            <w:tcBorders>
-              <w:top w:val="single" w:color="B8C0AE" w:sz="4"/>
-              <w:left w:val="single" w:color="B8C0AE" w:sz="4"/>
-              <w:bottom w:val="single" w:color="B8C0AE" w:sz="4"/>
-              <w:right w:val="single" w:color="B8C0AE" w:sz="4"/>
-            </w:tcBorders>
-            <w:shd w:fill="FFF3C4" w:color="auto" w:val="clear"/>
-            <w:tcMar>
-              <w:top w:type="dxa" w:w="70"/>
-              <w:left w:type="dxa" w:w="100"/>
-              <w:bottom w:type="dxa" w:w="70"/>
-              <w:right w:type="dxa" w:w="100"/>
-            </w:tcMar>
-          </w:tcPr>
-          <w:p>
-            <w:pPr>
-              <w:spacing w:after="80"/>
-            </w:pPr>
-            <w:r>
-              <w:rPr>
-                <w:rFonts w:ascii="Arial" w:cs="Arial" w:eastAsia="Arial" w:hAnsi="Arial"/>
-                <w:sz w:val="20"/>
-                <w:szCs w:val="20"/>
-              </w:rPr>
-              <w:t xml:space="preserve"/>
-            </w:r>
-          </w:p>
-        </w:tc>
-      </w:tr>
-    </w:tbl>
-    <w:p>
-      <w:pPr>
-        <w:pStyle w:val="Heading1"/>
-        <w:keepNext/>
-        <w:spacing w:after="120" w:before="320"/>
-      </w:pPr>
-      <w:r>
-        <w:rPr>
-          <w:rFonts w:ascii="Arial" w:cs="Arial" w:eastAsia="Arial" w:hAnsi="Arial"/>
-          <w:b/>
-          <w:bCs/>
-          <w:color w:val="2F4A2C"/>
           <w:sz w:val="26"/>
           <w:szCs w:val="26"/>
         </w:rPr>
@@ -4549,7 +3170,6 @@
     <w:r>
       <w:rPr>
         <w:rFonts w:ascii="Arial" w:cs="Arial" w:eastAsia="Arial" w:hAnsi="Arial"/>
-        <w:color w:val="777777"/>
         <w:sz w:val="16"/>
         <w:szCs w:val="16"/>
       </w:rPr>
@@ -4558,7 +3178,6 @@
     <w:r>
       <w:rPr>
         <w:rFonts w:ascii="Arial" w:cs="Arial" w:eastAsia="Arial" w:hAnsi="Arial"/>
-        <w:color w:val="777777"/>
         <w:sz w:val="16"/>
         <w:szCs w:val="16"/>
       </w:rPr>
@@ -4567,7 +3186,6 @@
     <w:r>
       <w:rPr>
         <w:rFonts w:ascii="Arial" w:cs="Arial" w:eastAsia="Arial" w:hAnsi="Arial"/>
-        <w:color w:val="777777"/>
         <w:sz w:val="16"/>
         <w:szCs w:val="16"/>
       </w:rPr>
@@ -4576,7 +3194,6 @@
     <w:r>
       <w:rPr>
         <w:rFonts w:ascii="Arial" w:cs="Arial" w:eastAsia="Arial" w:hAnsi="Arial"/>
-        <w:color w:val="777777"/>
         <w:sz w:val="16"/>
         <w:szCs w:val="16"/>
       </w:rPr>
@@ -4585,7 +3202,6 @@
     <w:r>
       <w:rPr>
         <w:rFonts w:ascii="Arial" w:cs="Arial" w:eastAsia="Arial" w:hAnsi="Arial"/>
-        <w:color w:val="777777"/>
         <w:sz w:val="16"/>
         <w:szCs w:val="16"/>
       </w:rPr>

</xml_diff>